<commit_message>
feat: add certificate output protection controls
</commit_message>
<xml_diff>
--- a/cursos/Guindauto.docx
+++ b/cursos/Guindauto.docx
@@ -1,12 +1,12 @@
 
 <file path=word/document.xml><?xml version="1.0" encoding="utf-8"?>
-<w:document xmlns:wpc="http://schemas.microsoft.com/office/word/2010/wordprocessingCanvas" xmlns:mc="http://schemas.openxmlformats.org/markup-compatibility/2006" xmlns:o="urn:schemas-microsoft-com:office:office" xmlns:r="http://schemas.openxmlformats.org/officeDocument/2006/relationships" xmlns:m="http://schemas.openxmlformats.org/officeDocument/2006/math" xmlns:v="urn:schemas-microsoft-com:vml" xmlns:wp14="http://schemas.microsoft.com/office/word/2010/wordprocessingDrawing" xmlns:wp="http://schemas.openxmlformats.org/drawingml/2006/wordprocessingDrawing" xmlns:w="http://schemas.openxmlformats.org/wordprocessingml/2006/main" xmlns:w14="http://schemas.microsoft.com/office/word/2010/wordml" xmlns:w10="urn:schemas-microsoft-com:office:word" xmlns:w15="http://schemas.microsoft.com/office/word/2012/wordml" xmlns:wpg="http://schemas.microsoft.com/office/word/2010/wordprocessingGroup" xmlns:wpi="http://schemas.microsoft.com/office/word/2010/wordprocessingInk" xmlns:wne="http://schemas.microsoft.com/office/word/2006/wordml" xmlns:wps="http://schemas.microsoft.com/office/word/2010/wordprocessingShape" xmlns:wpsCustomData="http://www.wps.cn/officeDocument/2013/wpsCustomData" mc:Ignorable="w14 w15 wp14">
+<w:document xmlns:ve="http://schemas.openxmlformats.org/markup-compatibility/2006" xmlns:o="urn:schemas-microsoft-com:office:office" xmlns:r="http://schemas.openxmlformats.org/officeDocument/2006/relationships" xmlns:m="http://schemas.openxmlformats.org/officeDocument/2006/math" xmlns:v="urn:schemas-microsoft-com:vml" xmlns:wp="http://schemas.openxmlformats.org/drawingml/2006/wordprocessingDrawing" xmlns:w10="urn:schemas-microsoft-com:office:word" xmlns:w="http://schemas.openxmlformats.org/wordprocessingml/2006/main" xmlns:wne="http://schemas.microsoft.com/office/word/2006/wordml">
   <w:body>
     <w:p>
       <w:pPr>
         <w:jc w:val="center"/>
         <w:rPr>
-          <w:rFonts w:ascii="Corsiva" w:hAnsi="Corsiva" w:eastAsia="Corsiva" w:cs="Corsiva"/>
+          <w:rFonts w:ascii="Corsiva" w:eastAsia="Corsiva" w:hAnsi="Corsiva" w:cs="Corsiva"/>
           <w:b/>
           <w:sz w:val="100"/>
           <w:szCs w:val="100"/>
@@ -14,7 +14,8 @@
       </w:pPr>
       <w:r>
         <w:rPr>
-          <w:rFonts w:eastAsia="Corsiva" w:cs="Corsiva" w:asciiTheme="minorHAnsi" w:hAnsiTheme="minorHAnsi"/>
+          <w:rFonts w:asciiTheme="minorHAnsi" w:eastAsia="Corsiva" w:hAnsiTheme="minorHAnsi" w:cs="Corsiva"/>
+          <w:noProof/>
         </w:rPr>
         <w:drawing>
           <wp:anchor distT="0" distB="0" distL="114300" distR="114300" simplePos="0" relativeHeight="251662336" behindDoc="1" locked="0" layoutInCell="1" allowOverlap="1">
@@ -42,10 +43,10 @@
                     </pic:cNvPicPr>
                   </pic:nvPicPr>
                   <pic:blipFill>
-                    <a:blip r:embed="rId12" cstate="print">
+                    <a:blip r:embed="rId9" cstate="print">
                       <a:extLst>
                         <a:ext uri="{28A0092B-C50C-407E-A947-70E740481C1C}">
-                          <a14:useLocalDpi xmlns:a14="http://schemas.microsoft.com/office/drawing/2010/main" val="0"/>
+                          <a14:useLocalDpi xmlns:a14="http://schemas.microsoft.com/office/drawing/2010/main" xmlns:wpsCustomData="http://www.wps.cn/officeDocument/2013/wpsCustomData" xmlns:wps="http://schemas.microsoft.com/office/word/2010/wordprocessingShape" xmlns:wpi="http://schemas.microsoft.com/office/word/2010/wordprocessingInk" xmlns:wpg="http://schemas.microsoft.com/office/word/2010/wordprocessingGroup" xmlns:w15="http://schemas.microsoft.com/office/word/2012/wordml" xmlns:w10="urn:schemas-microsoft-com:office:word" xmlns:w14="http://schemas.microsoft.com/office/word/2010/wordml" xmlns:w="http://schemas.openxmlformats.org/wordprocessingml/2006/main" xmlns:wp14="http://schemas.microsoft.com/office/word/2010/wordprocessingDrawing" xmlns:v="urn:schemas-microsoft-com:vml" xmlns:o="urn:schemas-microsoft-com:office:office" xmlns:mc="http://schemas.openxmlformats.org/markup-compatibility/2006" xmlns:wpc="http://schemas.microsoft.com/office/word/2010/wordprocessingCanvas" xmlns="" val="0"/>
                         </a:ext>
                       </a:extLst>
                     </a:blip>
@@ -75,15 +76,7 @@
       </w:r>
       <w:r>
         <w:rPr>
-          <w:rFonts w:ascii="Corsiva" w:hAnsi="Corsiva" w:eastAsia="Corsiva" w:cs="Corsiva"/>
-          <w:sz w:val="32"/>
-          <w:szCs w:val="32"/>
-        </w:rPr>
-        <w:t xml:space="preserve"> </w:t>
-      </w:r>
-      <w:r>
-        <w:rPr>
-          <w:rFonts w:ascii="Corsiva" w:hAnsi="Corsiva" w:eastAsia="Corsiva" w:cs="Corsiva"/>
+          <w:rFonts w:ascii="Corsiva" w:eastAsia="Corsiva" w:hAnsi="Corsiva" w:cs="Corsiva"/>
           <w:b/>
           <w:sz w:val="100"/>
           <w:szCs w:val="100"/>
@@ -95,7 +88,7 @@
       <w:pPr>
         <w:jc w:val="center"/>
         <w:rPr>
-          <w:rFonts w:ascii="Corsiva" w:hAnsi="Corsiva" w:eastAsia="Corsiva" w:cs="Corsiva"/>
+          <w:rFonts w:ascii="Corsiva" w:eastAsia="Corsiva" w:hAnsi="Corsiva" w:cs="Corsiva"/>
           <w:b/>
           <w:i/>
           <w:sz w:val="54"/>
@@ -111,16 +104,6 @@
         </w:rPr>
         <w:t>Segurança na Operação de Guindauto</w:t>
       </w:r>
-      <w:r>
-        <w:rPr>
-          <w:rFonts w:ascii="Corsiva" w:hAnsi="Corsiva" w:eastAsia="Corsiva" w:cs="Corsiva"/>
-          <w:b/>
-          <w:i/>
-          <w:sz w:val="54"/>
-          <w:szCs w:val="54"/>
-        </w:rPr>
-        <w:t xml:space="preserve"> </w:t>
-      </w:r>
     </w:p>
     <w:p>
       <w:pPr>
@@ -149,157 +132,7 @@
           <w:sz w:val="32"/>
           <w:szCs w:val="32"/>
         </w:rPr>
-        <w:t>Certifica que o Sr(a).</w:t>
-      </w:r>
-      <w:r>
-        <w:rPr>
-          <w:rFonts w:hint="default" w:ascii="Corsiva" w:hAnsi="Corsiva"/>
-          <w:b/>
-          <w:sz w:val="32"/>
-          <w:szCs w:val="32"/>
-          <w:lang w:val="pt-BR"/>
-        </w:rPr>
-        <w:t>{{NOME}}</w:t>
-      </w:r>
-      <w:r>
-        <w:rPr>
-          <w:rFonts w:ascii="Corsiva" w:hAnsi="Corsiva" w:cs="Arial"/>
-          <w:b/>
-          <w:sz w:val="32"/>
-          <w:szCs w:val="32"/>
-        </w:rPr>
-        <w:t xml:space="preserve">, </w:t>
-      </w:r>
-      <w:r>
-        <w:rPr>
-          <w:rFonts w:ascii="Corsiva" w:hAnsi="Corsiva" w:cs="Arial"/>
-          <w:sz w:val="32"/>
-          <w:szCs w:val="32"/>
-        </w:rPr>
-        <w:t>portador (a) da  ID</w:t>
-      </w:r>
-      <w:r>
-        <w:rPr>
-          <w:rFonts w:ascii="Corsiva" w:hAnsi="Corsiva" w:cs="Arial"/>
-          <w:b/>
-          <w:sz w:val="32"/>
-          <w:szCs w:val="32"/>
-        </w:rPr>
-        <w:t xml:space="preserve"> </w:t>
-      </w:r>
-      <w:r>
-        <w:rPr>
-          <w:rFonts w:hint="default" w:ascii="Corsiva" w:hAnsi="Corsiva"/>
-          <w:b/>
-          <w:sz w:val="32"/>
-          <w:szCs w:val="32"/>
-          <w:lang w:val="pt-BR"/>
-        </w:rPr>
-        <w:t>{{ID}}</w:t>
-      </w:r>
-      <w:r>
-        <w:rPr>
-          <w:rFonts w:ascii="Corsiva" w:hAnsi="Corsiva"/>
-          <w:b/>
-          <w:sz w:val="32"/>
-          <w:szCs w:val="32"/>
-        </w:rPr>
-        <w:t xml:space="preserve"> e </w:t>
-      </w:r>
-      <w:r>
-        <w:rPr>
-          <w:rFonts w:hint="default" w:ascii="Corsiva" w:hAnsi="Corsiva"/>
-          <w:b/>
-          <w:sz w:val="32"/>
-          <w:szCs w:val="32"/>
-          <w:lang w:val="pt-BR"/>
-        </w:rPr>
-        <w:t>{{CPF}}</w:t>
-      </w:r>
-      <w:r>
-        <w:rPr>
-          <w:rFonts w:ascii="Corsiva" w:hAnsi="Corsiva"/>
-          <w:b/>
-          <w:sz w:val="32"/>
-          <w:szCs w:val="32"/>
-        </w:rPr>
-        <w:t xml:space="preserve">  </w:t>
-      </w:r>
-      <w:r>
-        <w:rPr>
-          <w:rFonts w:ascii="Corsiva" w:hAnsi="Corsiva" w:cs="Arial"/>
-          <w:sz w:val="32"/>
-          <w:szCs w:val="32"/>
-        </w:rPr>
-        <w:t xml:space="preserve">por ter submetido e aprovado em treinamento, teórico e prático de </w:t>
-      </w:r>
-      <w:r>
-        <w:rPr>
-          <w:rFonts w:ascii="Corsiva" w:hAnsi="Corsiva" w:cs="Arial"/>
-          <w:b/>
-          <w:sz w:val="32"/>
-          <w:szCs w:val="32"/>
-        </w:rPr>
-        <w:t>Segurança na Operação de Guindauto</w:t>
-      </w:r>
-      <w:r>
-        <w:rPr>
-          <w:rFonts w:ascii="Corsiva" w:hAnsi="Corsiva" w:cs="Arial"/>
-          <w:sz w:val="32"/>
-          <w:szCs w:val="32"/>
-        </w:rPr>
-        <w:t xml:space="preserve"> de acordo com a Lei 6514/77, portaria 3.214 de 08/06/78. Normas Regulamentadora NR-11 e NR – 12 com carga horária de 16 horas, realizado no Município de </w:t>
-      </w:r>
-      <w:r>
-        <w:rPr>
-          <w:rFonts w:hint="default" w:ascii="Corsiva" w:hAnsi="Corsiva" w:cs="Arial"/>
-          <w:sz w:val="32"/>
-          <w:szCs w:val="32"/>
-          <w:lang w:val="pt-BR"/>
-        </w:rPr>
-        <w:t>{{CIDADE}}</w:t>
-      </w:r>
-      <w:r>
-        <w:rPr>
-          <w:rFonts w:ascii="Corsiva" w:hAnsi="Corsiva" w:cs="Arial"/>
-          <w:sz w:val="32"/>
-          <w:szCs w:val="32"/>
-        </w:rPr>
-        <w:t xml:space="preserve"> – </w:t>
-      </w:r>
-      <w:r>
-        <w:rPr>
-          <w:rFonts w:hint="default" w:ascii="Corsiva" w:hAnsi="Corsiva" w:cs="Arial"/>
-          <w:sz w:val="32"/>
-          <w:szCs w:val="32"/>
-          <w:lang w:val="pt-BR"/>
-        </w:rPr>
-        <w:t>{{UF}}</w:t>
-      </w:r>
-      <w:r>
-        <w:rPr>
-          <w:rFonts w:ascii="Corsiva" w:hAnsi="Corsiva" w:cs="Arial"/>
-          <w:sz w:val="32"/>
-          <w:szCs w:val="32"/>
-        </w:rPr>
-        <w:t xml:space="preserve"> no período de </w:t>
-      </w:r>
-      <w:r>
-        <w:rPr>
-          <w:rFonts w:hint="default" w:ascii="Corsiva" w:hAnsi="Corsiva"/>
-          <w:sz w:val="32"/>
-          <w:szCs w:val="32"/>
-          <w:lang w:val="pt-BR"/>
-        </w:rPr>
-        <w:t>{{PERIODO}}</w:t>
-      </w:r>
-      <w:r>
-        <w:rPr>
-          <w:rFonts w:ascii="Corsiva" w:hAnsi="Corsiva" w:cs="Arial"/>
-          <w:sz w:val="32"/>
-          <w:szCs w:val="32"/>
-        </w:rPr>
-        <w:t>.</w:t>
+        <w:t>Certifica que o Sr(a). {{NOME}}, portador(a) do RG {{ID}} e CPF {{CPF}}, foi submetido(a) e aprovado(a) em treinamento teórico e prático de Segurança na Operação de Guindauto, de acordo com a Lei 6.514/77, Portaria 3.214 de 08/06/78 e Normas Regulamentadoras NR-11 e NR-12, com carga horária de {{CARGA_HORARIA_COM_UNIDADE}}{{COMPLEMENTO_CARGA_HORARIA}}, realizado no município de {{CIDADE}} - {{UF}}, no período de {{PERIODO}}.</w:t>
       </w:r>
     </w:p>
     <w:p>
@@ -314,29 +147,11 @@
       </w:pPr>
       <w:r>
         <w:rPr>
-          <w:rFonts w:hint="default" w:ascii="Corsiva" w:hAnsi="Corsiva" w:cs="Tahoma"/>
-          <w:sz w:val="32"/>
-          <w:szCs w:val="32"/>
-          <w:lang w:val="pt-BR"/>
-        </w:rPr>
-        <w:t>{{CIDADE}}</w:t>
-      </w:r>
-      <w:r>
-        <w:rPr>
           <w:rFonts w:ascii="Corsiva" w:hAnsi="Corsiva" w:cs="Tahoma"/>
           <w:sz w:val="32"/>
           <w:szCs w:val="32"/>
         </w:rPr>
-        <w:t xml:space="preserve">, </w:t>
-      </w:r>
-      <w:r>
-        <w:rPr>
-          <w:rFonts w:hint="default" w:ascii="Corsiva" w:hAnsi="Corsiva" w:cs="Tahoma"/>
-          <w:sz w:val="32"/>
-          <w:szCs w:val="32"/>
-          <w:lang w:val="pt-BR"/>
-        </w:rPr>
-        <w:t>{{DATA_EXTENSO}}</w:t>
+        <w:t>{{CIDADE}}</w:t>
       </w:r>
       <w:r>
         <w:rPr>
@@ -344,22 +159,39 @@
           <w:sz w:val="32"/>
           <w:szCs w:val="32"/>
         </w:rPr>
-        <w:t>.</w:t>
-      </w:r>
-    </w:p>
-    <w:p>
-      <w:pPr>
-        <w:jc w:val="right"/>
-        <w:rPr>
-          <w:rFonts w:eastAsia="Corsiva" w:cs="Corsiva" w:asciiTheme="majorHAnsi" w:hAnsiTheme="majorHAnsi"/>
+        <w:t xml:space="preserve">, </w:t>
+      </w:r>
+      <w:r>
+        <w:rPr>
+          <w:rFonts w:ascii="Corsiva" w:hAnsi="Corsiva" w:cs="Tahoma"/>
           <w:sz w:val="32"/>
           <w:szCs w:val="32"/>
         </w:rPr>
-      </w:pPr>
-      <w:r>
-        <w:rPr>
-          <w:rFonts w:cs="Arial" w:asciiTheme="majorHAnsi" w:hAnsiTheme="majorHAnsi"/>
+        <w:t>{{DATA_EXTENSO}}</w:t>
+      </w:r>
+      <w:r>
+        <w:rPr>
+          <w:rFonts w:ascii="Corsiva" w:hAnsi="Corsiva" w:cs="Tahoma"/>
+          <w:sz w:val="32"/>
+          <w:szCs w:val="32"/>
+        </w:rPr>
+        <w:t>.</w:t>
+      </w:r>
+    </w:p>
+    <w:p>
+      <w:pPr>
+        <w:jc w:val="right"/>
+        <w:rPr>
+          <w:rFonts w:asciiTheme="majorHAnsi" w:eastAsia="Corsiva" w:hAnsiTheme="majorHAnsi" w:cs="Corsiva"/>
+          <w:sz w:val="32"/>
+          <w:szCs w:val="32"/>
+        </w:rPr>
+      </w:pPr>
+      <w:r>
+        <w:rPr>
+          <w:rFonts w:asciiTheme="majorHAnsi" w:hAnsiTheme="majorHAnsi" w:cs="Arial"/>
           <w:bCs/>
+          <w:noProof/>
         </w:rPr>
         <w:drawing>
           <wp:anchor distT="0" distB="0" distL="114300" distR="114300" simplePos="0" relativeHeight="251661312" behindDoc="1" locked="0" layoutInCell="1" allowOverlap="1">
@@ -387,10 +219,10 @@
                     </pic:cNvPicPr>
                   </pic:nvPicPr>
                   <pic:blipFill>
-                    <a:blip r:embed="rId13">
+                    <a:blip r:embed="rId10">
                       <a:extLst>
                         <a:ext uri="{28A0092B-C50C-407E-A947-70E740481C1C}">
-                          <a14:useLocalDpi xmlns:a14="http://schemas.microsoft.com/office/drawing/2010/main" val="0"/>
+                          <a14:useLocalDpi xmlns:a14="http://schemas.microsoft.com/office/drawing/2010/main" xmlns:wpsCustomData="http://www.wps.cn/officeDocument/2013/wpsCustomData" xmlns:wps="http://schemas.microsoft.com/office/word/2010/wordprocessingShape" xmlns:wpi="http://schemas.microsoft.com/office/word/2010/wordprocessingInk" xmlns:wpg="http://schemas.microsoft.com/office/word/2010/wordprocessingGroup" xmlns:w15="http://schemas.microsoft.com/office/word/2012/wordml" xmlns:w10="urn:schemas-microsoft-com:office:word" xmlns:w14="http://schemas.microsoft.com/office/word/2010/wordml" xmlns:w="http://schemas.openxmlformats.org/wordprocessingml/2006/main" xmlns:wp14="http://schemas.microsoft.com/office/word/2010/wordprocessingDrawing" xmlns:v="urn:schemas-microsoft-com:vml" xmlns:o="urn:schemas-microsoft-com:office:office" xmlns:mc="http://schemas.openxmlformats.org/markup-compatibility/2006" xmlns:wpc="http://schemas.microsoft.com/office/word/2010/wordprocessingCanvas" xmlns="" val="0"/>
                         </a:ext>
                       </a:extLst>
                     </a:blip>
@@ -419,7 +251,7 @@
     <w:p>
       <w:pPr>
         <w:rPr>
-          <w:rFonts w:eastAsia="Corsiva" w:cs="Corsiva" w:asciiTheme="majorHAnsi" w:hAnsiTheme="majorHAnsi"/>
+          <w:rFonts w:asciiTheme="majorHAnsi" w:eastAsia="Corsiva" w:hAnsiTheme="majorHAnsi" w:cs="Corsiva"/>
           <w:sz w:val="32"/>
           <w:szCs w:val="32"/>
         </w:rPr>
@@ -428,51 +260,83 @@
     <w:p>
       <w:pPr>
         <w:rPr>
-          <w:rFonts w:eastAsia="Corsiva" w:cs="Corsiva" w:asciiTheme="majorHAnsi" w:hAnsiTheme="majorHAnsi"/>
+          <w:rFonts w:asciiTheme="majorHAnsi" w:eastAsia="Corsiva" w:hAnsiTheme="majorHAnsi" w:cs="Corsiva"/>
           <w:sz w:val="32"/>
           <w:szCs w:val="32"/>
         </w:rPr>
       </w:pPr>
       <w:r>
         <w:rPr>
-          <w:rFonts w:eastAsia="Corsiva" w:cs="Corsiva" w:asciiTheme="majorHAnsi" w:hAnsiTheme="majorHAnsi"/>
+          <w:rFonts w:asciiTheme="majorHAnsi" w:eastAsia="Corsiva" w:hAnsiTheme="majorHAnsi" w:cs="Corsiva"/>
           <w:sz w:val="32"/>
           <w:szCs w:val="32"/>
         </w:rPr>
-        <w:t xml:space="preserve">Carlos Alexandre R.  Faria                                                                                                  __________________________                                                                                                         Reg.MTE 0056818/MG                                                                                                     </w:t>
-      </w:r>
-      <w:r>
-        <w:rPr>
-          <w:rFonts w:hint="default" w:eastAsia="Corsiva" w:cs="Corsiva" w:asciiTheme="majorHAnsi" w:hAnsiTheme="majorHAnsi"/>
+        <w:t>Carlos Alexandre R.  Faria                                                                                                  __________________________                                                                                                         R</w:t>
+      </w:r>
+      <w:r>
+        <w:rPr>
+          <w:rFonts w:asciiTheme="majorHAnsi" w:eastAsia="Corsiva" w:hAnsiTheme="majorHAnsi" w:cs="Corsiva"/>
           <w:sz w:val="32"/>
           <w:szCs w:val="32"/>
-          <w:lang w:val="pt-BR"/>
-        </w:rPr>
-        <w:t>{{NOME}}</w:t>
-      </w:r>
-      <w:r>
-        <w:rPr>
-          <w:rFonts w:eastAsia="Corsiva" w:cs="Corsiva" w:asciiTheme="majorHAnsi" w:hAnsiTheme="majorHAnsi"/>
+        </w:rPr>
+        <w:t xml:space="preserve">eg.MTE 0056818/MG                                                                                                     </w:t>
+      </w:r>
+      <w:r>
+        <w:rPr>
+          <w:rFonts w:asciiTheme="majorHAnsi" w:eastAsia="Corsiva" w:hAnsiTheme="majorHAnsi" w:cs="Corsiva"/>
           <w:sz w:val="32"/>
           <w:szCs w:val="32"/>
         </w:rPr>
-        <w:t xml:space="preserve">                                       </w:t>
+        <w:tab/>
+      </w:r>
+      <w:r>
+        <w:rPr>
+          <w:rFonts w:asciiTheme="majorHAnsi" w:eastAsia="Corsiva" w:hAnsiTheme="majorHAnsi" w:cs="Corsiva"/>
+          <w:sz w:val="32"/>
+          <w:szCs w:val="32"/>
+        </w:rPr>
+        <w:tab/>
+      </w:r>
+      <w:r>
+        <w:rPr>
+          <w:rFonts w:asciiTheme="majorHAnsi" w:eastAsia="Corsiva" w:hAnsiTheme="majorHAnsi" w:cs="Corsiva"/>
+          <w:sz w:val="32"/>
+          <w:szCs w:val="32"/>
+        </w:rPr>
+        <w:tab/>
+        <w:t>Aluno</w:t>
       </w:r>
       <w:bookmarkStart w:id="0" w:name="_GoBack"/>
       <w:bookmarkEnd w:id="0"/>
       <w:r>
         <w:rPr>
-          <w:rFonts w:eastAsia="Corsiva" w:cs="Corsiva" w:asciiTheme="majorHAnsi" w:hAnsiTheme="majorHAnsi"/>
+          <w:rFonts w:asciiTheme="majorHAnsi" w:eastAsia="Corsiva" w:hAnsiTheme="majorHAnsi" w:cs="Corsiva"/>
           <w:sz w:val="32"/>
           <w:szCs w:val="32"/>
         </w:rPr>
-        <w:t xml:space="preserve">                                                                                                                                                                                                                                                                                      Coren MG 001.312.974                                                                                                                                                                                        Reg. De CFC 40436</w:t>
-      </w:r>
-    </w:p>
-    <w:p>
-      <w:pPr>
-        <w:rPr>
-          <w:rFonts w:eastAsia="Corsiva" w:cs="Corsiva" w:asciiTheme="majorHAnsi" w:hAnsiTheme="majorHAnsi"/>
+        <w:t xml:space="preserve">                                                                                                                                  </w:t>
+      </w:r>
+      <w:r>
+        <w:rPr>
+          <w:rFonts w:asciiTheme="majorHAnsi" w:eastAsia="Corsiva" w:hAnsiTheme="majorHAnsi" w:cs="Corsiva"/>
+          <w:sz w:val="32"/>
+          <w:szCs w:val="32"/>
+        </w:rPr>
+        <w:t xml:space="preserve">                                                                                                                                                    Coren MG 001.312.974                                                                                        </w:t>
+      </w:r>
+      <w:r>
+        <w:rPr>
+          <w:rFonts w:asciiTheme="majorHAnsi" w:eastAsia="Corsiva" w:hAnsiTheme="majorHAnsi" w:cs="Corsiva"/>
+          <w:sz w:val="32"/>
+          <w:szCs w:val="32"/>
+        </w:rPr>
+        <w:t xml:space="preserve">                                                                                                Reg. De CFC 40436</w:t>
+      </w:r>
+    </w:p>
+    <w:p>
+      <w:pPr>
+        <w:rPr>
+          <w:rFonts w:asciiTheme="majorHAnsi" w:eastAsia="Corsiva" w:hAnsiTheme="majorHAnsi" w:cs="Corsiva"/>
           <w:sz w:val="32"/>
           <w:szCs w:val="32"/>
         </w:rPr>
@@ -490,20 +354,13 @@
       </w:pPr>
       <w:r>
         <w:rPr>
-          <w:rFonts w:eastAsia="Corsiva" w:cs="Corsiva" w:asciiTheme="majorHAnsi" w:hAnsiTheme="majorHAnsi"/>
+          <w:rFonts w:asciiTheme="majorHAnsi" w:eastAsia="Corsiva" w:hAnsiTheme="majorHAnsi" w:cs="Corsiva"/>
           <w:b/>
           <w:sz w:val="46"/>
           <w:szCs w:val="46"/>
         </w:rPr>
+        <w:lastRenderedPageBreak/>
         <w:t>CONTEÚDO PROGRAMÁTICO</w:t>
-      </w:r>
-      <w:r>
-        <w:rPr>
-          <w:rFonts w:eastAsia="Corsiva" w:cs="Corsiva" w:asciiTheme="majorHAnsi" w:hAnsiTheme="majorHAnsi"/>
-          <w:sz w:val="46"/>
-          <w:szCs w:val="46"/>
-        </w:rPr>
-        <w:t xml:space="preserve">                                                                                                   </w:t>
       </w:r>
     </w:p>
     <w:p>
@@ -519,7 +376,7 @@
     </w:p>
     <w:p>
       <w:pPr>
-        <w:pStyle w:val="18"/>
+        <w:pStyle w:val="PargrafodaLista"/>
         <w:numPr>
           <w:ilvl w:val="0"/>
           <w:numId w:val="1"/>
@@ -543,7 +400,7 @@
     </w:p>
     <w:p>
       <w:pPr>
-        <w:pStyle w:val="18"/>
+        <w:pStyle w:val="PargrafodaLista"/>
         <w:numPr>
           <w:ilvl w:val="0"/>
           <w:numId w:val="1"/>
@@ -562,12 +419,21 @@
           <w:szCs w:val="30"/>
           <w:lang w:eastAsia="pt-BR"/>
         </w:rPr>
-        <w:t>Seguraça e ambiente de trabalho</w:t>
-      </w:r>
-    </w:p>
-    <w:p>
-      <w:pPr>
-        <w:pStyle w:val="18"/>
+        <w:t>Seguraça e ambiente de tra</w:t>
+      </w:r>
+      <w:r>
+        <w:rPr>
+          <w:rFonts w:ascii="Corsiva" w:hAnsi="Corsiva" w:cs="Arial"/>
+          <w:sz w:val="30"/>
+          <w:szCs w:val="30"/>
+          <w:lang w:eastAsia="pt-BR"/>
+        </w:rPr>
+        <w:t>balho</w:t>
+      </w:r>
+    </w:p>
+    <w:p>
+      <w:pPr>
+        <w:pStyle w:val="PargrafodaLista"/>
         <w:numPr>
           <w:ilvl w:val="0"/>
           <w:numId w:val="1"/>
@@ -591,7 +457,7 @@
     </w:p>
     <w:p>
       <w:pPr>
-        <w:pStyle w:val="18"/>
+        <w:pStyle w:val="PargrafodaLista"/>
         <w:numPr>
           <w:ilvl w:val="0"/>
           <w:numId w:val="1"/>
@@ -615,7 +481,7 @@
     </w:p>
     <w:p>
       <w:pPr>
-        <w:pStyle w:val="18"/>
+        <w:pStyle w:val="PargrafodaLista"/>
         <w:numPr>
           <w:ilvl w:val="0"/>
           <w:numId w:val="1"/>
@@ -639,7 +505,7 @@
     </w:p>
     <w:p>
       <w:pPr>
-        <w:pStyle w:val="18"/>
+        <w:pStyle w:val="PargrafodaLista"/>
         <w:numPr>
           <w:ilvl w:val="0"/>
           <w:numId w:val="1"/>
@@ -663,7 +529,7 @@
     </w:p>
     <w:p>
       <w:pPr>
-        <w:pStyle w:val="18"/>
+        <w:pStyle w:val="PargrafodaLista"/>
         <w:numPr>
           <w:ilvl w:val="0"/>
           <w:numId w:val="1"/>
@@ -687,7 +553,7 @@
     </w:p>
     <w:p>
       <w:pPr>
-        <w:pStyle w:val="18"/>
+        <w:pStyle w:val="PargrafodaLista"/>
         <w:numPr>
           <w:ilvl w:val="0"/>
           <w:numId w:val="1"/>
@@ -711,7 +577,7 @@
     </w:p>
     <w:p>
       <w:pPr>
-        <w:pStyle w:val="18"/>
+        <w:pStyle w:val="PargrafodaLista"/>
         <w:numPr>
           <w:ilvl w:val="0"/>
           <w:numId w:val="1"/>
@@ -735,7 +601,7 @@
     </w:p>
     <w:p>
       <w:pPr>
-        <w:pStyle w:val="18"/>
+        <w:pStyle w:val="PargrafodaLista"/>
         <w:numPr>
           <w:ilvl w:val="0"/>
           <w:numId w:val="1"/>
@@ -754,12 +620,21 @@
           <w:szCs w:val="30"/>
           <w:lang w:eastAsia="pt-BR"/>
         </w:rPr>
-        <w:t>Aula Pratica como operar Corretamente Guindauto (Tipo Munck) e Guincho tipo prancha</w:t>
-      </w:r>
-    </w:p>
-    <w:p>
-      <w:pPr>
-        <w:pStyle w:val="18"/>
+        <w:t xml:space="preserve">Aula Pratica como operar </w:t>
+      </w:r>
+      <w:r>
+        <w:rPr>
+          <w:rFonts w:ascii="Corsiva" w:hAnsi="Corsiva" w:cs="Arial"/>
+          <w:sz w:val="30"/>
+          <w:szCs w:val="30"/>
+          <w:lang w:eastAsia="pt-BR"/>
+        </w:rPr>
+        <w:t>Corretamente Guindauto (Tipo Munck) e Guincho tipo prancha</w:t>
+      </w:r>
+    </w:p>
+    <w:p>
+      <w:pPr>
+        <w:pStyle w:val="PargrafodaLista"/>
         <w:numPr>
           <w:ilvl w:val="0"/>
           <w:numId w:val="1"/>
@@ -783,7 +658,7 @@
     </w:p>
     <w:p>
       <w:pPr>
-        <w:pStyle w:val="18"/>
+        <w:pStyle w:val="PargrafodaLista"/>
         <w:ind w:left="1080"/>
         <w:rPr>
           <w:rFonts w:ascii="Corsiva" w:hAnsi="Corsiva" w:cs="Arial"/>
@@ -843,20 +718,12 @@
         </w:rPr>
         <w:t xml:space="preserve">Média Aprovação – 9,5   </w:t>
       </w:r>
-      <w:r>
-        <w:rPr>
-          <w:rFonts w:ascii="Monotype Corsiva" w:hAnsi="Monotype Corsiva" w:cs="Arial"/>
-          <w:sz w:val="36"/>
-          <w:szCs w:val="36"/>
-        </w:rPr>
-        <w:t xml:space="preserve">                                                                                                  </w:t>
-      </w:r>
     </w:p>
     <w:p>
       <w:pPr>
         <w:jc w:val="center"/>
         <w:rPr>
-          <w:rFonts w:ascii="Corsiva" w:hAnsi="Corsiva" w:eastAsia="Corsiva" w:cs="Corsiva"/>
+          <w:rFonts w:ascii="Corsiva" w:eastAsia="Corsiva" w:hAnsi="Corsiva" w:cs="Corsiva"/>
           <w:sz w:val="18"/>
           <w:szCs w:val="18"/>
         </w:rPr>
@@ -866,63 +733,85 @@
       <w:pPr>
         <w:jc w:val="center"/>
         <w:rPr>
-          <w:rFonts w:hint="default" w:ascii="Corsiva" w:hAnsi="Corsiva" w:eastAsia="Corsiva" w:cs="Corsiva"/>
+          <w:rFonts w:ascii="Corsiva" w:eastAsia="Corsiva" w:hAnsi="Corsiva" w:cs="Corsiva"/>
           <w:sz w:val="24"/>
           <w:szCs w:val="24"/>
-          <w:lang w:val="pt-BR"/>
-        </w:rPr>
-      </w:pPr>
-      <w:r>
-        <w:rPr>
-          <w:rFonts w:ascii="Corsiva" w:hAnsi="Corsiva" w:eastAsia="Corsiva" w:cs="Corsiva"/>
-          <w:sz w:val="32"/>
-          <w:szCs w:val="32"/>
-        </w:rPr>
-        <w:t xml:space="preserve">        </w:t>
-      </w:r>
-      <w:r>
-        <w:rPr>
-          <w:rFonts w:ascii="Corsiva" w:hAnsi="Corsiva" w:eastAsia="Corsiva" w:cs="Corsiva"/>
+        </w:rPr>
+      </w:pPr>
+      <w:r>
+        <w:rPr>
+          <w:rFonts w:ascii="Corsiva" w:eastAsia="Corsiva" w:hAnsi="Corsiva" w:cs="Corsiva"/>
           <w:sz w:val="24"/>
           <w:szCs w:val="24"/>
         </w:rPr>
-        <w:t>T.C.S   CURSOS E SERVIÇOS  CNPJ 32.340.932/0001-70   RUA: ABÍLIO TAVARES PIRES Nº199    BAIRRO : CENTENÁRIO                                                                                                                                                       CIDADE : CATAGUASES  - M. G  CEL: (32)  99996-7877 –(32) 98490-5610</w:t>
-      </w:r>
-      <w:r>
-        <w:rPr>
-          <w:rFonts w:hint="default" w:ascii="Corsiva" w:hAnsi="Corsiva" w:eastAsia="Corsiva" w:cs="Corsiva"/>
+        <w:t>T.C.S   CURSOS E SERVIÇOS  CNPJ 32.340.932/0001-70   RUA: ABÍLIO TAVARES</w:t>
+      </w:r>
+      <w:r>
+        <w:rPr>
+          <w:rFonts w:ascii="Corsiva" w:eastAsia="Corsiva" w:hAnsi="Corsiva" w:cs="Corsiva"/>
           <w:sz w:val="24"/>
           <w:szCs w:val="24"/>
-          <w:lang w:val="pt-BR"/>
-        </w:rPr>
-        <w:t xml:space="preserve"> Numeração-{{COD}}</w:t>
+        </w:rPr>
+        <w:t xml:space="preserve"> PIRES Nº199    BAIRRO : CENTENÁRIO                                                                                                                                                       CIDADE : CATAGUASES  - M. G  CEL: (32)  99996-7877 –(32) 98490-5610</w:t>
+      </w:r>
+      <w:r>
+        <w:rPr>
+          <w:rFonts w:ascii="Corsiva" w:eastAsia="Corsiva" w:hAnsi="Corsiva" w:cs="Corsiva"/>
+          <w:sz w:val="24"/>
+          <w:szCs w:val="24"/>
+        </w:rPr>
+        <w:t xml:space="preserve"> Nu</w:t>
+      </w:r>
+      <w:r>
+        <w:rPr>
+          <w:rFonts w:ascii="Corsiva" w:eastAsia="Corsiva" w:hAnsi="Corsiva" w:cs="Corsiva"/>
+          <w:sz w:val="24"/>
+          <w:szCs w:val="24"/>
+        </w:rPr>
+        <w:t>meração</w:t>
+      </w:r>
+      <w:r>
+        <w:rPr>
+          <w:rFonts w:ascii="Corsiva" w:eastAsia="Corsiva" w:hAnsi="Corsiva" w:cs="Corsiva"/>
+          <w:sz w:val="24"/>
+          <w:szCs w:val="24"/>
+        </w:rPr>
+        <w:t>:</w:t>
+      </w:r>
+      <w:r>
+        <w:rPr>
+          <w:rFonts w:ascii="Corsiva" w:eastAsia="Corsiva" w:hAnsi="Corsiva" w:cs="Corsiva"/>
+          <w:sz w:val="24"/>
+          <w:szCs w:val="24"/>
+        </w:rPr>
+        <w:t>{{COD}}</w:t>
       </w:r>
     </w:p>
     <w:sectPr>
-      <w:headerReference r:id="rId7" w:type="first"/>
-      <w:footerReference r:id="rId10" w:type="first"/>
-      <w:headerReference r:id="rId5" w:type="default"/>
-      <w:footerReference r:id="rId8" w:type="default"/>
-      <w:headerReference r:id="rId6" w:type="even"/>
-      <w:footerReference r:id="rId9" w:type="even"/>
+      <w:headerReference w:type="even" r:id="rId11"/>
+      <w:headerReference w:type="default" r:id="rId12"/>
+      <w:footerReference w:type="even" r:id="rId13"/>
+      <w:footerReference w:type="default" r:id="rId14"/>
+      <w:headerReference w:type="first" r:id="rId15"/>
+      <w:footerReference w:type="first" r:id="rId16"/>
       <w:pgSz w:w="16838" w:h="11906" w:orient="landscape"/>
       <w:pgMar w:top="284" w:right="851" w:bottom="0" w:left="820" w:header="427" w:footer="708" w:gutter="0"/>
       <w:pgBorders w:offsetFrom="page">
-        <w:top w:val="single" w:color="FF0000" w:sz="48" w:space="24"/>
-        <w:left w:val="single" w:color="FF0000" w:sz="48" w:space="24"/>
-        <w:bottom w:val="single" w:color="FF0000" w:sz="48" w:space="24"/>
-        <w:right w:val="single" w:color="FF0000" w:sz="48" w:space="24"/>
+        <w:top w:val="single" w:sz="48" w:space="24" w:color="FF0000"/>
+        <w:left w:val="single" w:sz="48" w:space="24" w:color="FF0000"/>
+        <w:bottom w:val="single" w:sz="48" w:space="24" w:color="FF0000"/>
+        <w:right w:val="single" w:sz="48" w:space="24" w:color="FF0000"/>
       </w:pgBorders>
       <w:pgNumType w:start="1"/>
-      <w:cols w:space="720" w:num="1"/>
-      <w:docGrid w:linePitch="299" w:charSpace="0"/>
+      <w:cols w:space="720"/>
+      <w:docGrid w:linePitch="299"/>
     </w:sectPr>
   </w:body>
 </w:document>
 </file>
 
 <file path=word/endnotes.xml><?xml version="1.0" encoding="utf-8"?>
-<w:endnotes xmlns:wpc="http://schemas.microsoft.com/office/word/2010/wordprocessingCanvas" xmlns:mc="http://schemas.openxmlformats.org/markup-compatibility/2006" xmlns:o="urn:schemas-microsoft-com:office:office" xmlns:r="http://schemas.openxmlformats.org/officeDocument/2006/relationships" xmlns:m="http://schemas.openxmlformats.org/officeDocument/2006/math" xmlns:v="urn:schemas-microsoft-com:vml" xmlns:wp14="http://schemas.microsoft.com/office/word/2010/wordprocessingDrawing" xmlns:wp="http://schemas.openxmlformats.org/drawingml/2006/wordprocessingDrawing" xmlns:w="http://schemas.openxmlformats.org/wordprocessingml/2006/main" xmlns:w14="http://schemas.microsoft.com/office/word/2010/wordml" xmlns:w15="http://schemas.microsoft.com/office/word/2012/wordml" xmlns:w10="urn:schemas-microsoft-com:office:word" xmlns:wpg="http://schemas.microsoft.com/office/word/2010/wordprocessingGroup" xmlns:wpi="http://schemas.microsoft.com/office/word/2010/wordprocessingInk" xmlns:wne="http://schemas.microsoft.com/office/word/2006/wordml" xmlns:wps="http://schemas.microsoft.com/office/word/2010/wordprocessingShape" xmlns:wpsCustomData="http://www.wps.cn/officeDocument/2013/wpsCustomData" mc:Ignorable="w14 w15 wp14">
+<w:endnotes xmlns:ve="http://schemas.openxmlformats.org/markup-compatibility/2006" xmlns:o="urn:schemas-microsoft-com:office:office" xmlns:r="http://schemas.openxmlformats.org/officeDocument/2006/relationships" xmlns:m="http://schemas.openxmlformats.org/officeDocument/2006/math" xmlns:v="urn:schemas-microsoft-com:vml" xmlns:wp="http://schemas.openxmlformats.org/drawingml/2006/wordprocessingDrawing" xmlns:w10="urn:schemas-microsoft-com:office:word" xmlns:w="http://schemas.openxmlformats.org/wordprocessingml/2006/main" xmlns:wne="http://schemas.microsoft.com/office/word/2006/wordml">
   <w:endnote w:type="separator" w:id="0">
     <w:p>
       <w:pPr>
@@ -947,41 +836,41 @@
 </file>
 
 <file path=word/footer1.xml><?xml version="1.0" encoding="utf-8"?>
-<w:ftr xmlns:wpc="http://schemas.microsoft.com/office/word/2010/wordprocessingCanvas" xmlns:mc="http://schemas.openxmlformats.org/markup-compatibility/2006" xmlns:o="urn:schemas-microsoft-com:office:office" xmlns:r="http://schemas.openxmlformats.org/officeDocument/2006/relationships" xmlns:m="http://schemas.openxmlformats.org/officeDocument/2006/math" xmlns:v="urn:schemas-microsoft-com:vml" xmlns:wp14="http://schemas.microsoft.com/office/word/2010/wordprocessingDrawing" xmlns:wp="http://schemas.openxmlformats.org/drawingml/2006/wordprocessingDrawing" xmlns:w10="urn:schemas-microsoft-com:office:word" xmlns:w="http://schemas.openxmlformats.org/wordprocessingml/2006/main" xmlns:w14="http://schemas.microsoft.com/office/word/2010/wordml" xmlns:w15="http://schemas.microsoft.com/office/word/2012/wordml" xmlns:wpg="http://schemas.microsoft.com/office/word/2010/wordprocessingGroup" xmlns:wpi="http://schemas.microsoft.com/office/word/2010/wordprocessingInk" xmlns:wne="http://schemas.microsoft.com/office/word/2006/wordml" xmlns:wps="http://schemas.microsoft.com/office/word/2010/wordprocessingShape" xmlns:wpsCustomData="http://www.wps.cn/officeDocument/2013/wpsCustomData" mc:Ignorable="w14 w15 wp14">
+<w:ftr xmlns:ve="http://schemas.openxmlformats.org/markup-compatibility/2006" xmlns:o="urn:schemas-microsoft-com:office:office" xmlns:r="http://schemas.openxmlformats.org/officeDocument/2006/relationships" xmlns:m="http://schemas.openxmlformats.org/officeDocument/2006/math" xmlns:v="urn:schemas-microsoft-com:vml" xmlns:wp="http://schemas.openxmlformats.org/drawingml/2006/wordprocessingDrawing" xmlns:w10="urn:schemas-microsoft-com:office:word" xmlns:w="http://schemas.openxmlformats.org/wordprocessingml/2006/main" xmlns:wne="http://schemas.microsoft.com/office/word/2006/wordml">
   <w:p>
     <w:pPr>
-      <w:pStyle w:val="11"/>
+      <w:pStyle w:val="Rodap"/>
     </w:pPr>
   </w:p>
 </w:ftr>
 </file>
 
 <file path=word/footer2.xml><?xml version="1.0" encoding="utf-8"?>
-<w:ftr xmlns:wpc="http://schemas.microsoft.com/office/word/2010/wordprocessingCanvas" xmlns:mc="http://schemas.openxmlformats.org/markup-compatibility/2006" xmlns:o="urn:schemas-microsoft-com:office:office" xmlns:r="http://schemas.openxmlformats.org/officeDocument/2006/relationships" xmlns:m="http://schemas.openxmlformats.org/officeDocument/2006/math" xmlns:v="urn:schemas-microsoft-com:vml" xmlns:wp14="http://schemas.microsoft.com/office/word/2010/wordprocessingDrawing" xmlns:wp="http://schemas.openxmlformats.org/drawingml/2006/wordprocessingDrawing" xmlns:w10="urn:schemas-microsoft-com:office:word" xmlns:w="http://schemas.openxmlformats.org/wordprocessingml/2006/main" xmlns:w14="http://schemas.microsoft.com/office/word/2010/wordml" xmlns:w15="http://schemas.microsoft.com/office/word/2012/wordml" xmlns:wpg="http://schemas.microsoft.com/office/word/2010/wordprocessingGroup" xmlns:wpi="http://schemas.microsoft.com/office/word/2010/wordprocessingInk" xmlns:wne="http://schemas.microsoft.com/office/word/2006/wordml" xmlns:wps="http://schemas.microsoft.com/office/word/2010/wordprocessingShape" xmlns:wpsCustomData="http://www.wps.cn/officeDocument/2013/wpsCustomData" mc:Ignorable="w14 w15 wp14">
+<w:ftr xmlns:ve="http://schemas.openxmlformats.org/markup-compatibility/2006" xmlns:o="urn:schemas-microsoft-com:office:office" xmlns:r="http://schemas.openxmlformats.org/officeDocument/2006/relationships" xmlns:m="http://schemas.openxmlformats.org/officeDocument/2006/math" xmlns:v="urn:schemas-microsoft-com:vml" xmlns:wp="http://schemas.openxmlformats.org/drawingml/2006/wordprocessingDrawing" xmlns:w10="urn:schemas-microsoft-com:office:word" xmlns:w="http://schemas.openxmlformats.org/wordprocessingml/2006/main" xmlns:wne="http://schemas.microsoft.com/office/word/2006/wordml">
   <w:p>
     <w:pPr>
-      <w:pStyle w:val="11"/>
+      <w:pStyle w:val="Rodap"/>
     </w:pPr>
   </w:p>
 </w:ftr>
 </file>
 
 <file path=word/footer3.xml><?xml version="1.0" encoding="utf-8"?>
-<w:ftr xmlns:wpc="http://schemas.microsoft.com/office/word/2010/wordprocessingCanvas" xmlns:mc="http://schemas.openxmlformats.org/markup-compatibility/2006" xmlns:o="urn:schemas-microsoft-com:office:office" xmlns:r="http://schemas.openxmlformats.org/officeDocument/2006/relationships" xmlns:m="http://schemas.openxmlformats.org/officeDocument/2006/math" xmlns:v="urn:schemas-microsoft-com:vml" xmlns:wp14="http://schemas.microsoft.com/office/word/2010/wordprocessingDrawing" xmlns:wp="http://schemas.openxmlformats.org/drawingml/2006/wordprocessingDrawing" xmlns:w10="urn:schemas-microsoft-com:office:word" xmlns:w="http://schemas.openxmlformats.org/wordprocessingml/2006/main" xmlns:w14="http://schemas.microsoft.com/office/word/2010/wordml" xmlns:w15="http://schemas.microsoft.com/office/word/2012/wordml" xmlns:wpg="http://schemas.microsoft.com/office/word/2010/wordprocessingGroup" xmlns:wpi="http://schemas.microsoft.com/office/word/2010/wordprocessingInk" xmlns:wne="http://schemas.microsoft.com/office/word/2006/wordml" xmlns:wps="http://schemas.microsoft.com/office/word/2010/wordprocessingShape" xmlns:wpsCustomData="http://www.wps.cn/officeDocument/2013/wpsCustomData" mc:Ignorable="w14 w15 wp14">
+<w:ftr xmlns:ve="http://schemas.openxmlformats.org/markup-compatibility/2006" xmlns:o="urn:schemas-microsoft-com:office:office" xmlns:r="http://schemas.openxmlformats.org/officeDocument/2006/relationships" xmlns:m="http://schemas.openxmlformats.org/officeDocument/2006/math" xmlns:v="urn:schemas-microsoft-com:vml" xmlns:wp="http://schemas.openxmlformats.org/drawingml/2006/wordprocessingDrawing" xmlns:w10="urn:schemas-microsoft-com:office:word" xmlns:w="http://schemas.openxmlformats.org/wordprocessingml/2006/main" xmlns:wne="http://schemas.microsoft.com/office/word/2006/wordml">
   <w:p>
     <w:pPr>
-      <w:pStyle w:val="11"/>
+      <w:pStyle w:val="Rodap"/>
     </w:pPr>
   </w:p>
 </w:ftr>
 </file>
 
 <file path=word/footnotes.xml><?xml version="1.0" encoding="utf-8"?>
-<w:footnotes xmlns:wpc="http://schemas.microsoft.com/office/word/2010/wordprocessingCanvas" xmlns:mc="http://schemas.openxmlformats.org/markup-compatibility/2006" xmlns:o="urn:schemas-microsoft-com:office:office" xmlns:r="http://schemas.openxmlformats.org/officeDocument/2006/relationships" xmlns:m="http://schemas.openxmlformats.org/officeDocument/2006/math" xmlns:v="urn:schemas-microsoft-com:vml" xmlns:wp14="http://schemas.microsoft.com/office/word/2010/wordprocessingDrawing" xmlns:wp="http://schemas.openxmlformats.org/drawingml/2006/wordprocessingDrawing" xmlns:w="http://schemas.openxmlformats.org/wordprocessingml/2006/main" xmlns:w14="http://schemas.microsoft.com/office/word/2010/wordml" xmlns:w15="http://schemas.microsoft.com/office/word/2012/wordml" xmlns:w10="urn:schemas-microsoft-com:office:word" xmlns:wpg="http://schemas.microsoft.com/office/word/2010/wordprocessingGroup" xmlns:wpi="http://schemas.microsoft.com/office/word/2010/wordprocessingInk" xmlns:wne="http://schemas.microsoft.com/office/word/2006/wordml" xmlns:wps="http://schemas.microsoft.com/office/word/2010/wordprocessingShape" xmlns:wpsCustomData="http://www.wps.cn/officeDocument/2013/wpsCustomData" mc:Ignorable="w14 w15 wp14">
+<w:footnotes xmlns:ve="http://schemas.openxmlformats.org/markup-compatibility/2006" xmlns:o="urn:schemas-microsoft-com:office:office" xmlns:r="http://schemas.openxmlformats.org/officeDocument/2006/relationships" xmlns:m="http://schemas.openxmlformats.org/officeDocument/2006/math" xmlns:v="urn:schemas-microsoft-com:vml" xmlns:wp="http://schemas.openxmlformats.org/drawingml/2006/wordprocessingDrawing" xmlns:w10="urn:schemas-microsoft-com:office:word" xmlns:w="http://schemas.openxmlformats.org/wordprocessingml/2006/main" xmlns:wne="http://schemas.microsoft.com/office/word/2006/wordml">
   <w:footnote w:type="separator" w:id="0">
     <w:p>
       <w:pPr>
-        <w:spacing w:before="0" w:after="0" w:line="276" w:lineRule="auto"/>
+        <w:spacing w:after="0"/>
       </w:pPr>
       <w:r>
         <w:separator/>
@@ -991,7 +880,7 @@
   <w:footnote w:type="continuationSeparator" w:id="1">
     <w:p>
       <w:pPr>
-        <w:spacing w:before="0" w:after="0" w:line="276" w:lineRule="auto"/>
+        <w:spacing w:after="0"/>
       </w:pPr>
       <w:r>
         <w:continuationSeparator/>
@@ -1002,7 +891,7 @@
 </file>
 
 <file path=word/header1.xml><?xml version="1.0" encoding="utf-8"?>
-<w:hdr xmlns:wpc="http://schemas.microsoft.com/office/word/2010/wordprocessingCanvas" xmlns:mc="http://schemas.openxmlformats.org/markup-compatibility/2006" xmlns:o="urn:schemas-microsoft-com:office:office" xmlns:r="http://schemas.openxmlformats.org/officeDocument/2006/relationships" xmlns:m="http://schemas.openxmlformats.org/officeDocument/2006/math" xmlns:v="urn:schemas-microsoft-com:vml" xmlns:wp14="http://schemas.microsoft.com/office/word/2010/wordprocessingDrawing" xmlns:wp="http://schemas.openxmlformats.org/drawingml/2006/wordprocessingDrawing" xmlns:w10="urn:schemas-microsoft-com:office:word" xmlns:w="http://schemas.openxmlformats.org/wordprocessingml/2006/main" xmlns:w14="http://schemas.microsoft.com/office/word/2010/wordml" xmlns:w15="http://schemas.microsoft.com/office/word/2012/wordml" xmlns:wpg="http://schemas.microsoft.com/office/word/2010/wordprocessingGroup" xmlns:wpi="http://schemas.microsoft.com/office/word/2010/wordprocessingInk" xmlns:wne="http://schemas.microsoft.com/office/word/2006/wordml" xmlns:wps="http://schemas.microsoft.com/office/word/2010/wordprocessingShape" xmlns:wpsCustomData="http://www.wps.cn/officeDocument/2013/wpsCustomData" mc:Ignorable="w14 w15 wp14">
+<w:hdr xmlns:ve="http://schemas.openxmlformats.org/markup-compatibility/2006" xmlns:o="urn:schemas-microsoft-com:office:office" xmlns:r="http://schemas.openxmlformats.org/officeDocument/2006/relationships" xmlns:m="http://schemas.openxmlformats.org/officeDocument/2006/math" xmlns:v="urn:schemas-microsoft-com:vml" xmlns:wp="http://schemas.openxmlformats.org/drawingml/2006/wordprocessingDrawing" xmlns:w10="urn:schemas-microsoft-com:office:word" xmlns:w="http://schemas.openxmlformats.org/wordprocessingml/2006/main" xmlns:wne="http://schemas.microsoft.com/office/word/2006/wordml">
   <w:p>
     <w:pPr>
       <w:tabs>
@@ -1019,12 +908,28 @@
         <w:color w:val="000000"/>
       </w:rPr>
       <w:pict>
-        <v:shape id="WordPictureWatermark4887357" o:spid="_x0000_s2050" o:spt="75" type="#_x0000_t75" style="position:absolute;left:0pt;height:520.7pt;width:757.4pt;mso-position-horizontal:center;mso-position-horizontal-relative:margin;mso-position-vertical:center;mso-position-vertical-relative:margin;z-index:-251656192;mso-width-relative:page;mso-height-relative:page;" filled="f" o:preferrelative="t" stroked="f" coordsize="21600,21600" o:allowincell="f">
-          <v:path/>
-          <v:fill on="f" focussize="0,0"/>
-          <v:stroke on="f" joinstyle="miter"/>
-          <v:imagedata r:id="rId1" gain="19661f" blacklevel="22938f" o:title="Logo nova centralizada - Cópia"/>
+        <v:shapetype id="_x0000_t75" coordsize="21600,21600" o:spt="75" o:preferrelative="t" path="m@4@5l@4@11@9@11@9@5xe" filled="f" stroked="f">
+          <v:stroke joinstyle="miter"/>
+          <v:formulas>
+            <v:f eqn="if lineDrawn pixelLineWidth 0"/>
+            <v:f eqn="sum @0 1 0"/>
+            <v:f eqn="sum 0 0 @1"/>
+            <v:f eqn="prod @2 1 2"/>
+            <v:f eqn="prod @3 21600 pixelWidth"/>
+            <v:f eqn="prod @3 21600 pixelHeight"/>
+            <v:f eqn="sum @0 0 1"/>
+            <v:f eqn="prod @6 1 2"/>
+            <v:f eqn="prod @7 21600 pixelWidth"/>
+            <v:f eqn="sum @8 21600 0"/>
+            <v:f eqn="prod @7 21600 pixelHeight"/>
+            <v:f eqn="sum @10 21600 0"/>
+          </v:formulas>
+          <v:path o:extrusionok="f" gradientshapeok="t" o:connecttype="rect"/>
           <o:lock v:ext="edit" aspectratio="t"/>
+        </v:shapetype>
+        <v:shape id="WordPictureWatermark4887356" o:spid="_x0000_s2051" type="#_x0000_t75" style="position:absolute;margin-left:0;margin-top:0;width:757.4pt;height:520.7pt;z-index:-251659776;mso-position-horizontal:center;mso-position-horizontal-relative:margin;mso-position-vertical:center;mso-position-vertical-relative:margin" o:allowincell="f">
+          <v:imagedata r:id="rId1" o:title="Logo nova centralizada - Cópia" gain="19661f" blacklevel="22938f"/>
+          <w10:wrap anchorx="margin" anchory="margin"/>
         </v:shape>
       </w:pict>
     </w:r>
@@ -1033,7 +938,7 @@
 </file>
 
 <file path=word/header2.xml><?xml version="1.0" encoding="utf-8"?>
-<w:hdr xmlns:wpc="http://schemas.microsoft.com/office/word/2010/wordprocessingCanvas" xmlns:mc="http://schemas.openxmlformats.org/markup-compatibility/2006" xmlns:o="urn:schemas-microsoft-com:office:office" xmlns:r="http://schemas.openxmlformats.org/officeDocument/2006/relationships" xmlns:m="http://schemas.openxmlformats.org/officeDocument/2006/math" xmlns:v="urn:schemas-microsoft-com:vml" xmlns:wp14="http://schemas.microsoft.com/office/word/2010/wordprocessingDrawing" xmlns:wp="http://schemas.openxmlformats.org/drawingml/2006/wordprocessingDrawing" xmlns:w10="urn:schemas-microsoft-com:office:word" xmlns:w="http://schemas.openxmlformats.org/wordprocessingml/2006/main" xmlns:w14="http://schemas.microsoft.com/office/word/2010/wordml" xmlns:w15="http://schemas.microsoft.com/office/word/2012/wordml" xmlns:wpg="http://schemas.microsoft.com/office/word/2010/wordprocessingGroup" xmlns:wpi="http://schemas.microsoft.com/office/word/2010/wordprocessingInk" xmlns:wne="http://schemas.microsoft.com/office/word/2006/wordml" xmlns:wps="http://schemas.microsoft.com/office/word/2010/wordprocessingShape" xmlns:wpsCustomData="http://www.wps.cn/officeDocument/2013/wpsCustomData" mc:Ignorable="w14 w15 wp14">
+<w:hdr xmlns:ve="http://schemas.openxmlformats.org/markup-compatibility/2006" xmlns:o="urn:schemas-microsoft-com:office:office" xmlns:r="http://schemas.openxmlformats.org/officeDocument/2006/relationships" xmlns:m="http://schemas.openxmlformats.org/officeDocument/2006/math" xmlns:v="urn:schemas-microsoft-com:vml" xmlns:wp="http://schemas.openxmlformats.org/drawingml/2006/wordprocessingDrawing" xmlns:w10="urn:schemas-microsoft-com:office:word" xmlns:w="http://schemas.openxmlformats.org/wordprocessingml/2006/main" xmlns:wne="http://schemas.microsoft.com/office/word/2006/wordml">
   <w:p>
     <w:pPr>
       <w:tabs>
@@ -1050,12 +955,28 @@
         <w:color w:val="000000"/>
       </w:rPr>
       <w:pict>
-        <v:shape id="WordPictureWatermark4887356" o:spid="_x0000_s2051" o:spt="75" type="#_x0000_t75" style="position:absolute;left:0pt;height:520.7pt;width:757.4pt;mso-position-horizontal:center;mso-position-horizontal-relative:margin;mso-position-vertical:center;mso-position-vertical-relative:margin;z-index:-251657216;mso-width-relative:page;mso-height-relative:page;" filled="f" o:preferrelative="t" stroked="f" coordsize="21600,21600" o:allowincell="f">
-          <v:path/>
-          <v:fill on="f" focussize="0,0"/>
-          <v:stroke on="f" joinstyle="miter"/>
-          <v:imagedata r:id="rId1" gain="19661f" blacklevel="22938f" o:title="Logo nova centralizada - Cópia"/>
+        <v:shapetype id="_x0000_t75" coordsize="21600,21600" o:spt="75" o:preferrelative="t" path="m@4@5l@4@11@9@11@9@5xe" filled="f" stroked="f">
+          <v:stroke joinstyle="miter"/>
+          <v:formulas>
+            <v:f eqn="if lineDrawn pixelLineWidth 0"/>
+            <v:f eqn="sum @0 1 0"/>
+            <v:f eqn="sum 0 0 @1"/>
+            <v:f eqn="prod @2 1 2"/>
+            <v:f eqn="prod @3 21600 pixelWidth"/>
+            <v:f eqn="prod @3 21600 pixelHeight"/>
+            <v:f eqn="sum @0 0 1"/>
+            <v:f eqn="prod @6 1 2"/>
+            <v:f eqn="prod @7 21600 pixelWidth"/>
+            <v:f eqn="sum @8 21600 0"/>
+            <v:f eqn="prod @7 21600 pixelHeight"/>
+            <v:f eqn="sum @10 21600 0"/>
+          </v:formulas>
+          <v:path o:extrusionok="f" gradientshapeok="t" o:connecttype="rect"/>
           <o:lock v:ext="edit" aspectratio="t"/>
+        </v:shapetype>
+        <v:shape id="WordPictureWatermark4887357" o:spid="_x0000_s2050" type="#_x0000_t75" style="position:absolute;margin-left:0;margin-top:0;width:757.4pt;height:520.7pt;z-index:-251657728;mso-position-horizontal:center;mso-position-horizontal-relative:margin;mso-position-vertical:center;mso-position-vertical-relative:margin" o:allowincell="f">
+          <v:imagedata r:id="rId1" o:title="Logo nova centralizada - Cópia" gain="19661f" blacklevel="22938f"/>
+          <w10:wrap anchorx="margin" anchory="margin"/>
         </v:shape>
       </w:pict>
     </w:r>
@@ -1064,7 +985,7 @@
 </file>
 
 <file path=word/header3.xml><?xml version="1.0" encoding="utf-8"?>
-<w:hdr xmlns:wpc="http://schemas.microsoft.com/office/word/2010/wordprocessingCanvas" xmlns:mc="http://schemas.openxmlformats.org/markup-compatibility/2006" xmlns:o="urn:schemas-microsoft-com:office:office" xmlns:r="http://schemas.openxmlformats.org/officeDocument/2006/relationships" xmlns:m="http://schemas.openxmlformats.org/officeDocument/2006/math" xmlns:v="urn:schemas-microsoft-com:vml" xmlns:wp14="http://schemas.microsoft.com/office/word/2010/wordprocessingDrawing" xmlns:wp="http://schemas.openxmlformats.org/drawingml/2006/wordprocessingDrawing" xmlns:w10="urn:schemas-microsoft-com:office:word" xmlns:w="http://schemas.openxmlformats.org/wordprocessingml/2006/main" xmlns:w14="http://schemas.microsoft.com/office/word/2010/wordml" xmlns:w15="http://schemas.microsoft.com/office/word/2012/wordml" xmlns:wpg="http://schemas.microsoft.com/office/word/2010/wordprocessingGroup" xmlns:wpi="http://schemas.microsoft.com/office/word/2010/wordprocessingInk" xmlns:wne="http://schemas.microsoft.com/office/word/2006/wordml" xmlns:wps="http://schemas.microsoft.com/office/word/2010/wordprocessingShape" xmlns:wpsCustomData="http://www.wps.cn/officeDocument/2013/wpsCustomData" mc:Ignorable="w14 w15 wp14">
+<w:hdr xmlns:ve="http://schemas.openxmlformats.org/markup-compatibility/2006" xmlns:o="urn:schemas-microsoft-com:office:office" xmlns:r="http://schemas.openxmlformats.org/officeDocument/2006/relationships" xmlns:m="http://schemas.openxmlformats.org/officeDocument/2006/math" xmlns:v="urn:schemas-microsoft-com:vml" xmlns:wp="http://schemas.openxmlformats.org/drawingml/2006/wordprocessingDrawing" xmlns:w10="urn:schemas-microsoft-com:office:word" xmlns:w="http://schemas.openxmlformats.org/wordprocessingml/2006/main" xmlns:wne="http://schemas.microsoft.com/office/word/2006/wordml">
   <w:p>
     <w:pPr>
       <w:tabs>
@@ -1081,12 +1002,28 @@
         <w:color w:val="000000"/>
       </w:rPr>
       <w:pict>
-        <v:shape id="WordPictureWatermark4887355" o:spid="_x0000_s2049" o:spt="75" type="#_x0000_t75" style="position:absolute;left:0pt;height:520.7pt;width:757.4pt;mso-position-horizontal:center;mso-position-horizontal-relative:margin;mso-position-vertical:center;mso-position-vertical-relative:margin;z-index:-251656192;mso-width-relative:page;mso-height-relative:page;" filled="f" o:preferrelative="t" stroked="f" coordsize="21600,21600" o:allowincell="f">
-          <v:path/>
-          <v:fill on="f" focussize="0,0"/>
-          <v:stroke on="f" joinstyle="miter"/>
-          <v:imagedata r:id="rId1" gain="19661f" blacklevel="22938f" o:title="Logo nova centralizada - Cópia"/>
+        <v:shapetype id="_x0000_t75" coordsize="21600,21600" o:spt="75" o:preferrelative="t" path="m@4@5l@4@11@9@11@9@5xe" filled="f" stroked="f">
+          <v:stroke joinstyle="miter"/>
+          <v:formulas>
+            <v:f eqn="if lineDrawn pixelLineWidth 0"/>
+            <v:f eqn="sum @0 1 0"/>
+            <v:f eqn="sum 0 0 @1"/>
+            <v:f eqn="prod @2 1 2"/>
+            <v:f eqn="prod @3 21600 pixelWidth"/>
+            <v:f eqn="prod @3 21600 pixelHeight"/>
+            <v:f eqn="sum @0 0 1"/>
+            <v:f eqn="prod @6 1 2"/>
+            <v:f eqn="prod @7 21600 pixelWidth"/>
+            <v:f eqn="sum @8 21600 0"/>
+            <v:f eqn="prod @7 21600 pixelHeight"/>
+            <v:f eqn="sum @10 21600 0"/>
+          </v:formulas>
+          <v:path o:extrusionok="f" gradientshapeok="t" o:connecttype="rect"/>
           <o:lock v:ext="edit" aspectratio="t"/>
+        </v:shapetype>
+        <v:shape id="WordPictureWatermark4887355" o:spid="_x0000_s2049" type="#_x0000_t75" style="position:absolute;margin-left:0;margin-top:0;width:757.4pt;height:520.7pt;z-index:-251658752;mso-position-horizontal:center;mso-position-horizontal-relative:margin;mso-position-vertical:center;mso-position-vertical-relative:margin" o:allowincell="f">
+          <v:imagedata r:id="rId1" o:title="Logo nova centralizada - Cópia" gain="19661f" blacklevel="22938f"/>
+          <w10:wrap anchorx="margin" anchory="margin"/>
         </v:shape>
       </w:pict>
     </w:r>
@@ -1095,12 +1032,12 @@
 </file>
 
 <file path=word/numbering.xml><?xml version="1.0" encoding="utf-8"?>
-<w:numbering xmlns:wpc="http://schemas.microsoft.com/office/word/2010/wordprocessingCanvas" xmlns:mc="http://schemas.openxmlformats.org/markup-compatibility/2006" xmlns:o="urn:schemas-microsoft-com:office:office" xmlns:r="http://schemas.openxmlformats.org/officeDocument/2006/relationships" xmlns:m="http://schemas.openxmlformats.org/officeDocument/2006/math" xmlns:v="urn:schemas-microsoft-com:vml" xmlns:wp14="http://schemas.microsoft.com/office/word/2010/wordprocessingDrawing" xmlns:wp="http://schemas.openxmlformats.org/drawingml/2006/wordprocessingDrawing" xmlns:w10="urn:schemas-microsoft-com:office:word" xmlns:w="http://schemas.openxmlformats.org/wordprocessingml/2006/main" xmlns:w14="http://schemas.microsoft.com/office/word/2010/wordml" xmlns:wpg="http://schemas.microsoft.com/office/word/2010/wordprocessingGroup" xmlns:wpi="http://schemas.microsoft.com/office/word/2010/wordprocessingInk" xmlns:wne="http://schemas.microsoft.com/office/word/2006/wordml" xmlns:wps="http://schemas.microsoft.com/office/word/2010/wordprocessingShape" xmlns:wpsCustomData="http://www.wps.cn/officeDocument/2013/wpsCustomData" mc:Ignorable="w14 wp14">
+<w:numbering xmlns:ve="http://schemas.openxmlformats.org/markup-compatibility/2006" xmlns:o="urn:schemas-microsoft-com:office:office" xmlns:r="http://schemas.openxmlformats.org/officeDocument/2006/relationships" xmlns:m="http://schemas.openxmlformats.org/officeDocument/2006/math" xmlns:v="urn:schemas-microsoft-com:vml" xmlns:wp="http://schemas.openxmlformats.org/drawingml/2006/wordprocessingDrawing" xmlns:w10="urn:schemas-microsoft-com:office:word" xmlns:w="http://schemas.openxmlformats.org/wordprocessingml/2006/main" xmlns:wne="http://schemas.microsoft.com/office/word/2006/wordml">
   <w:abstractNum w:abstractNumId="0">
     <w:nsid w:val="1CA06240"/>
     <w:multiLevelType w:val="multilevel"/>
     <w:tmpl w:val="1CA06240"/>
-    <w:lvl w:ilvl="0" w:tentative="0">
+    <w:lvl w:ilvl="0">
       <w:start w:val="1"/>
       <w:numFmt w:val="lowerLetter"/>
       <w:lvlText w:val="%1)"/>
@@ -1112,7 +1049,7 @@
         <w:rFonts w:hint="default"/>
       </w:rPr>
     </w:lvl>
-    <w:lvl w:ilvl="1" w:tentative="0">
+    <w:lvl w:ilvl="1">
       <w:start w:val="1"/>
       <w:numFmt w:val="lowerLetter"/>
       <w:lvlText w:val="%2."/>
@@ -1121,7 +1058,7 @@
         <w:ind w:left="1800" w:hanging="360"/>
       </w:pPr>
     </w:lvl>
-    <w:lvl w:ilvl="2" w:tentative="0">
+    <w:lvl w:ilvl="2">
       <w:start w:val="1"/>
       <w:numFmt w:val="lowerRoman"/>
       <w:lvlText w:val="%3."/>
@@ -1130,7 +1067,7 @@
         <w:ind w:left="2520" w:hanging="180"/>
       </w:pPr>
     </w:lvl>
-    <w:lvl w:ilvl="3" w:tentative="0">
+    <w:lvl w:ilvl="3">
       <w:start w:val="1"/>
       <w:numFmt w:val="decimal"/>
       <w:lvlText w:val="%4."/>
@@ -1139,7 +1076,7 @@
         <w:ind w:left="3240" w:hanging="360"/>
       </w:pPr>
     </w:lvl>
-    <w:lvl w:ilvl="4" w:tentative="0">
+    <w:lvl w:ilvl="4">
       <w:start w:val="1"/>
       <w:numFmt w:val="lowerLetter"/>
       <w:lvlText w:val="%5."/>
@@ -1148,7 +1085,7 @@
         <w:ind w:left="3960" w:hanging="360"/>
       </w:pPr>
     </w:lvl>
-    <w:lvl w:ilvl="5" w:tentative="0">
+    <w:lvl w:ilvl="5">
       <w:start w:val="1"/>
       <w:numFmt w:val="lowerRoman"/>
       <w:lvlText w:val="%6."/>
@@ -1157,7 +1094,7 @@
         <w:ind w:left="4680" w:hanging="180"/>
       </w:pPr>
     </w:lvl>
-    <w:lvl w:ilvl="6" w:tentative="0">
+    <w:lvl w:ilvl="6">
       <w:start w:val="1"/>
       <w:numFmt w:val="decimal"/>
       <w:lvlText w:val="%7."/>
@@ -1166,7 +1103,7 @@
         <w:ind w:left="5400" w:hanging="360"/>
       </w:pPr>
     </w:lvl>
-    <w:lvl w:ilvl="7" w:tentative="0">
+    <w:lvl w:ilvl="7">
       <w:start w:val="1"/>
       <w:numFmt w:val="lowerLetter"/>
       <w:lvlText w:val="%8."/>
@@ -1175,7 +1112,7 @@
         <w:ind w:left="6120" w:hanging="360"/>
       </w:pPr>
     </w:lvl>
-    <w:lvl w:ilvl="8" w:tentative="0">
+    <w:lvl w:ilvl="8">
       <w:start w:val="1"/>
       <w:numFmt w:val="lowerRoman"/>
       <w:lvlText w:val="%9."/>
@@ -1192,188 +1129,75 @@
 </file>
 
 <file path=word/styles.xml><?xml version="1.0" encoding="utf-8"?>
-<w:styles xmlns:mc="http://schemas.openxmlformats.org/markup-compatibility/2006" xmlns:o="urn:schemas-microsoft-com:office:office" xmlns:r="http://schemas.openxmlformats.org/officeDocument/2006/relationships" xmlns:m="http://schemas.openxmlformats.org/officeDocument/2006/math" xmlns:v="urn:schemas-microsoft-com:vml" xmlns:w="http://schemas.openxmlformats.org/wordprocessingml/2006/main" xmlns:w14="http://schemas.microsoft.com/office/word/2010/wordml" xmlns:w10="urn:schemas-microsoft-com:office:word" xmlns:sl="http://schemas.openxmlformats.org/schemaLibrary/2006/main" xmlns:wpsCustomData="http://www.wps.cn/officeDocument/2013/wpsCustomData" mc:Ignorable="w14">
+<w:styles xmlns:r="http://schemas.openxmlformats.org/officeDocument/2006/relationships" xmlns:w="http://schemas.openxmlformats.org/wordprocessingml/2006/main">
   <w:docDefaults>
     <w:rPrDefault>
       <w:rPr>
-        <w:rFonts w:ascii="Times New Roman" w:hAnsi="Times New Roman" w:eastAsia="SimSun" w:cs="Times New Roman"/>
+        <w:rFonts w:ascii="Times New Roman" w:eastAsia="SimSun" w:hAnsi="Times New Roman" w:cs="Times New Roman"/>
+        <w:lang w:val="pt-BR" w:eastAsia="pt-BR" w:bidi="ar-SA"/>
       </w:rPr>
     </w:rPrDefault>
     <w:pPrDefault/>
   </w:docDefaults>
-  <w:latentStyles w:count="260" w:defQFormat="0" w:defUnhideWhenUsed="1" w:defSemiHidden="1" w:defUIPriority="99" w:defLockedState="0">
-    <w:lsdException w:qFormat="1" w:unhideWhenUsed="0" w:uiPriority="0" w:semiHidden="0" w:name="Normal"/>
-    <w:lsdException w:qFormat="1" w:unhideWhenUsed="0" w:uiPriority="9" w:semiHidden="0" w:name="heading 1"/>
-    <w:lsdException w:qFormat="1" w:uiPriority="9" w:name="heading 2"/>
-    <w:lsdException w:qFormat="1" w:uiPriority="9" w:name="heading 3"/>
-    <w:lsdException w:qFormat="1" w:uiPriority="9" w:name="heading 4"/>
-    <w:lsdException w:qFormat="1" w:uiPriority="9" w:name="heading 5"/>
-    <w:lsdException w:qFormat="1" w:uiPriority="9" w:name="heading 6"/>
-    <w:lsdException w:qFormat="1" w:uiPriority="9" w:name="heading 7"/>
-    <w:lsdException w:qFormat="1" w:uiPriority="9" w:name="heading 8"/>
-    <w:lsdException w:qFormat="1" w:uiPriority="9" w:name="heading 9"/>
-    <w:lsdException w:uiPriority="99" w:name="index 1"/>
-    <w:lsdException w:uiPriority="99" w:name="index 2"/>
-    <w:lsdException w:uiPriority="99" w:name="index 3"/>
-    <w:lsdException w:uiPriority="99" w:name="index 4"/>
-    <w:lsdException w:uiPriority="99" w:name="index 5"/>
-    <w:lsdException w:uiPriority="99" w:name="index 6"/>
-    <w:lsdException w:uiPriority="99" w:name="index 7"/>
-    <w:lsdException w:uiPriority="99" w:name="index 8"/>
-    <w:lsdException w:uiPriority="99" w:name="index 9"/>
-    <w:lsdException w:uiPriority="39" w:name="toc 1"/>
-    <w:lsdException w:uiPriority="39" w:name="toc 2"/>
-    <w:lsdException w:uiPriority="39" w:name="toc 3"/>
-    <w:lsdException w:uiPriority="39" w:name="toc 4"/>
-    <w:lsdException w:uiPriority="39" w:name="toc 5"/>
-    <w:lsdException w:uiPriority="39" w:name="toc 6"/>
-    <w:lsdException w:uiPriority="39" w:name="toc 7"/>
-    <w:lsdException w:uiPriority="39" w:name="toc 8"/>
-    <w:lsdException w:uiPriority="39" w:name="toc 9"/>
-    <w:lsdException w:uiPriority="99" w:name="Normal Indent"/>
-    <w:lsdException w:uiPriority="99" w:name="footnote text"/>
-    <w:lsdException w:uiPriority="99" w:name="annotation text"/>
-    <w:lsdException w:uiPriority="99" w:name="header"/>
-    <w:lsdException w:qFormat="1" w:uiPriority="99" w:semiHidden="0" w:name="footer"/>
-    <w:lsdException w:uiPriority="99" w:name="index heading"/>
-    <w:lsdException w:qFormat="1" w:uiPriority="35" w:name="caption"/>
-    <w:lsdException w:uiPriority="99" w:name="table of figures"/>
-    <w:lsdException w:uiPriority="99" w:name="envelope address"/>
-    <w:lsdException w:uiPriority="99" w:name="envelope return"/>
-    <w:lsdException w:uiPriority="99" w:name="footnote reference"/>
-    <w:lsdException w:uiPriority="99" w:name="annotation reference"/>
-    <w:lsdException w:uiPriority="99" w:name="line number"/>
-    <w:lsdException w:uiPriority="99" w:name="page number"/>
-    <w:lsdException w:uiPriority="99" w:name="endnote reference"/>
-    <w:lsdException w:uiPriority="99" w:name="endnote text"/>
-    <w:lsdException w:uiPriority="99" w:name="table of authorities"/>
-    <w:lsdException w:uiPriority="99" w:name="macro"/>
-    <w:lsdException w:uiPriority="99" w:name="toa heading"/>
-    <w:lsdException w:uiPriority="99" w:name="List"/>
-    <w:lsdException w:uiPriority="99" w:name="List Bullet"/>
-    <w:lsdException w:uiPriority="99" w:name="List Number"/>
-    <w:lsdException w:uiPriority="99" w:name="List 2"/>
-    <w:lsdException w:uiPriority="99" w:name="List 3"/>
-    <w:lsdException w:uiPriority="99" w:name="List 4"/>
-    <w:lsdException w:uiPriority="99" w:name="List 5"/>
-    <w:lsdException w:uiPriority="99" w:name="List Bullet 2"/>
-    <w:lsdException w:uiPriority="99" w:name="List Bullet 3"/>
-    <w:lsdException w:uiPriority="99" w:name="List Bullet 4"/>
-    <w:lsdException w:uiPriority="99" w:name="List Bullet 5"/>
-    <w:lsdException w:uiPriority="99" w:name="List Number 2"/>
-    <w:lsdException w:uiPriority="99" w:name="List Number 3"/>
-    <w:lsdException w:uiPriority="99" w:name="List Number 4"/>
-    <w:lsdException w:uiPriority="99" w:name="List Number 5"/>
-    <w:lsdException w:qFormat="1" w:unhideWhenUsed="0" w:uiPriority="10" w:semiHidden="0" w:name="Title"/>
-    <w:lsdException w:uiPriority="99" w:name="Closing"/>
-    <w:lsdException w:uiPriority="99" w:name="Signature"/>
-    <w:lsdException w:qFormat="1" w:uiPriority="1" w:name="Default Paragraph Font"/>
-    <w:lsdException w:uiPriority="99" w:name="Body Text"/>
-    <w:lsdException w:uiPriority="99" w:name="Body Text Indent"/>
-    <w:lsdException w:uiPriority="99" w:name="List Continue"/>
-    <w:lsdException w:uiPriority="99" w:name="List Continue 2"/>
-    <w:lsdException w:uiPriority="99" w:name="List Continue 3"/>
-    <w:lsdException w:uiPriority="99" w:name="List Continue 4"/>
-    <w:lsdException w:uiPriority="99" w:name="List Continue 5"/>
-    <w:lsdException w:uiPriority="99" w:name="Message Header"/>
-    <w:lsdException w:qFormat="1" w:unhideWhenUsed="0" w:uiPriority="11" w:semiHidden="0" w:name="Subtitle"/>
-    <w:lsdException w:uiPriority="99" w:name="Salutation"/>
-    <w:lsdException w:uiPriority="99" w:name="Date"/>
-    <w:lsdException w:uiPriority="99" w:name="Body Text First Indent"/>
-    <w:lsdException w:uiPriority="99" w:name="Body Text First Indent 2"/>
-    <w:lsdException w:uiPriority="99" w:name="Note Heading"/>
-    <w:lsdException w:uiPriority="99" w:name="Body Text 2"/>
-    <w:lsdException w:uiPriority="99" w:name="Body Text 3"/>
-    <w:lsdException w:uiPriority="99" w:name="Body Text Indent 2"/>
-    <w:lsdException w:uiPriority="99" w:name="Body Text Indent 3"/>
-    <w:lsdException w:uiPriority="99" w:name="Block Text"/>
-    <w:lsdException w:uiPriority="99" w:name="Hyperlink"/>
-    <w:lsdException w:uiPriority="99" w:name="FollowedHyperlink"/>
-    <w:lsdException w:qFormat="1" w:unhideWhenUsed="0" w:uiPriority="22" w:semiHidden="0" w:name="Strong"/>
-    <w:lsdException w:qFormat="1" w:unhideWhenUsed="0" w:uiPriority="20" w:semiHidden="0" w:name="Emphasis"/>
-    <w:lsdException w:uiPriority="99" w:name="Document Map"/>
-    <w:lsdException w:uiPriority="99" w:name="Plain Text"/>
-    <w:lsdException w:uiPriority="99" w:name="E-mail Signature"/>
-    <w:lsdException w:uiPriority="99" w:name="Normal (Web)"/>
-    <w:lsdException w:uiPriority="99" w:name="HTML Acronym"/>
-    <w:lsdException w:uiPriority="99" w:name="HTML Address"/>
-    <w:lsdException w:uiPriority="99" w:name="HTML Cite"/>
-    <w:lsdException w:uiPriority="99" w:name="HTML Code"/>
-    <w:lsdException w:uiPriority="99" w:name="HTML Definition"/>
-    <w:lsdException w:uiPriority="99" w:name="HTML Keyboard"/>
-    <w:lsdException w:uiPriority="99" w:name="HTML Preformatted"/>
-    <w:lsdException w:uiPriority="99" w:name="HTML Sample"/>
-    <w:lsdException w:uiPriority="99" w:name="HTML Typewriter"/>
-    <w:lsdException w:uiPriority="99" w:name="HTML Variable"/>
-    <w:lsdException w:qFormat="1" w:uiPriority="99" w:name="Normal Table"/>
-    <w:lsdException w:uiPriority="99" w:name="annotation subject"/>
-    <w:lsdException w:uiPriority="99" w:name="Table Simple 1"/>
-    <w:lsdException w:uiPriority="99" w:name="Table Simple 2"/>
-    <w:lsdException w:uiPriority="99" w:name="Table Simple 3"/>
-    <w:lsdException w:uiPriority="99" w:name="Table Classic 1"/>
-    <w:lsdException w:uiPriority="99" w:name="Table Classic 2"/>
-    <w:lsdException w:uiPriority="99" w:name="Table Classic 3"/>
-    <w:lsdException w:uiPriority="99" w:name="Table Classic 4"/>
-    <w:lsdException w:uiPriority="99" w:name="Table Colorful 1"/>
-    <w:lsdException w:uiPriority="99" w:name="Table Colorful 2"/>
-    <w:lsdException w:uiPriority="99" w:name="Table Colorful 3"/>
-    <w:lsdException w:uiPriority="99" w:name="Table Columns 1"/>
-    <w:lsdException w:uiPriority="99" w:name="Table Columns 2"/>
-    <w:lsdException w:uiPriority="99" w:name="Table Columns 3"/>
-    <w:lsdException w:uiPriority="99" w:name="Table Columns 4"/>
-    <w:lsdException w:uiPriority="99" w:name="Table Columns 5"/>
-    <w:lsdException w:uiPriority="99" w:name="Table Grid 1"/>
-    <w:lsdException w:uiPriority="99" w:name="Table Grid 2"/>
-    <w:lsdException w:uiPriority="99" w:name="Table Grid 3"/>
-    <w:lsdException w:uiPriority="99" w:name="Table Grid 4"/>
-    <w:lsdException w:uiPriority="99" w:name="Table Grid 5"/>
-    <w:lsdException w:uiPriority="99" w:name="Table Grid 6"/>
-    <w:lsdException w:uiPriority="99" w:name="Table Grid 7"/>
-    <w:lsdException w:uiPriority="99" w:name="Table Grid 8"/>
-    <w:lsdException w:uiPriority="99" w:name="Table List 1"/>
-    <w:lsdException w:uiPriority="99" w:name="Table List 2"/>
-    <w:lsdException w:uiPriority="99" w:name="Table List 3"/>
-    <w:lsdException w:uiPriority="99" w:name="Table List 4"/>
-    <w:lsdException w:uiPriority="99" w:name="Table List 5"/>
-    <w:lsdException w:uiPriority="99" w:name="Table List 6"/>
-    <w:lsdException w:uiPriority="99" w:name="Table List 7"/>
-    <w:lsdException w:uiPriority="99" w:name="Table List 8"/>
-    <w:lsdException w:uiPriority="99" w:name="Table 3D effects 1"/>
-    <w:lsdException w:uiPriority="99" w:name="Table 3D effects 2"/>
-    <w:lsdException w:uiPriority="99" w:name="Table 3D effects 3"/>
-    <w:lsdException w:uiPriority="99" w:name="Table Contemporary"/>
-    <w:lsdException w:uiPriority="99" w:name="Table Elegant"/>
-    <w:lsdException w:uiPriority="99" w:name="Table Professional"/>
-    <w:lsdException w:uiPriority="99" w:name="Table Subtle 1"/>
-    <w:lsdException w:uiPriority="99" w:name="Table Subtle 2"/>
-    <w:lsdException w:uiPriority="99" w:name="Table Web 1"/>
-    <w:lsdException w:uiPriority="99" w:name="Table Web 2"/>
-    <w:lsdException w:uiPriority="99" w:name="Table Web 3"/>
-    <w:lsdException w:qFormat="1" w:uiPriority="99" w:name="Balloon Text"/>
-    <w:lsdException w:unhideWhenUsed="0" w:uiPriority="39" w:semiHidden="0" w:name="Table Grid"/>
-    <w:lsdException w:uiPriority="99" w:name="Table Theme"/>
-    <w:lsdException w:qFormat="1" w:unhideWhenUsed="0" w:uiPriority="34" w:semiHidden="0" w:name="List Paragraph"/>
+  <w:latentStyles w:defLockedState="0" w:defUIPriority="99" w:defSemiHidden="1" w:defUnhideWhenUsed="1" w:defQFormat="0" w:count="267">
+    <w:lsdException w:name="Normal" w:semiHidden="0" w:uiPriority="0" w:unhideWhenUsed="0" w:qFormat="1"/>
+    <w:lsdException w:name="heading 1" w:semiHidden="0" w:uiPriority="9" w:unhideWhenUsed="0" w:qFormat="1"/>
+    <w:lsdException w:name="heading 2" w:uiPriority="9" w:qFormat="1"/>
+    <w:lsdException w:name="heading 3" w:uiPriority="9" w:qFormat="1"/>
+    <w:lsdException w:name="heading 4" w:uiPriority="9" w:qFormat="1"/>
+    <w:lsdException w:name="heading 5" w:uiPriority="9" w:qFormat="1"/>
+    <w:lsdException w:name="heading 6" w:uiPriority="9" w:qFormat="1"/>
+    <w:lsdException w:name="heading 7" w:uiPriority="9" w:qFormat="1"/>
+    <w:lsdException w:name="heading 8" w:uiPriority="9" w:qFormat="1"/>
+    <w:lsdException w:name="heading 9" w:uiPriority="9" w:qFormat="1"/>
+    <w:lsdException w:name="toc 1" w:uiPriority="39"/>
+    <w:lsdException w:name="toc 2" w:uiPriority="39"/>
+    <w:lsdException w:name="toc 3" w:uiPriority="39"/>
+    <w:lsdException w:name="toc 4" w:uiPriority="39"/>
+    <w:lsdException w:name="toc 5" w:uiPriority="39"/>
+    <w:lsdException w:name="toc 6" w:uiPriority="39"/>
+    <w:lsdException w:name="toc 7" w:uiPriority="39"/>
+    <w:lsdException w:name="toc 8" w:uiPriority="39"/>
+    <w:lsdException w:name="toc 9" w:uiPriority="39"/>
+    <w:lsdException w:name="footer" w:semiHidden="0" w:qFormat="1"/>
+    <w:lsdException w:name="caption" w:uiPriority="35" w:qFormat="1"/>
+    <w:lsdException w:name="Title" w:semiHidden="0" w:uiPriority="10" w:unhideWhenUsed="0" w:qFormat="1"/>
+    <w:lsdException w:name="Default Paragraph Font" w:uiPriority="1" w:qFormat="1"/>
+    <w:lsdException w:name="Subtitle" w:semiHidden="0" w:uiPriority="11" w:unhideWhenUsed="0" w:qFormat="1"/>
+    <w:lsdException w:name="Strong" w:semiHidden="0" w:uiPriority="22" w:unhideWhenUsed="0" w:qFormat="1"/>
+    <w:lsdException w:name="Emphasis" w:semiHidden="0" w:uiPriority="20" w:unhideWhenUsed="0" w:qFormat="1"/>
+    <w:lsdException w:name="Normal Table" w:qFormat="1"/>
+    <w:lsdException w:name="Balloon Text" w:qFormat="1"/>
+    <w:lsdException w:name="Table Grid" w:semiHidden="0" w:uiPriority="39" w:unhideWhenUsed="0"/>
+    <w:lsdException w:name="List Paragraph" w:semiHidden="0" w:uiPriority="34" w:unhideWhenUsed="0" w:qFormat="1"/>
+    <w:lsdException w:name="Subtle Emphasis" w:semiHidden="0" w:uiPriority="19" w:unhideWhenUsed="0" w:qFormat="1"/>
+    <w:lsdException w:name="Intense Emphasis" w:semiHidden="0" w:uiPriority="21" w:unhideWhenUsed="0" w:qFormat="1"/>
+    <w:lsdException w:name="Subtle Reference" w:semiHidden="0" w:uiPriority="31" w:unhideWhenUsed="0" w:qFormat="1"/>
+    <w:lsdException w:name="Intense Reference" w:semiHidden="0" w:uiPriority="32" w:unhideWhenUsed="0" w:qFormat="1"/>
+    <w:lsdException w:name="Book Title" w:semiHidden="0" w:uiPriority="33" w:unhideWhenUsed="0" w:qFormat="1"/>
+    <w:lsdException w:name="Bibliography" w:uiPriority="37"/>
+    <w:lsdException w:name="TOC Heading" w:uiPriority="39" w:qFormat="1"/>
   </w:latentStyles>
-  <w:style w:type="paragraph" w:default="1" w:styleId="1">
+  <w:style w:type="paragraph" w:default="1" w:styleId="Normal">
     <w:name w:val="Normal"/>
     <w:qFormat/>
-    <w:uiPriority w:val="0"/>
+    <w:rsid w:val="00663F73"/>
     <w:pPr>
       <w:spacing w:after="200" w:line="276" w:lineRule="auto"/>
     </w:pPr>
     <w:rPr>
-      <w:rFonts w:ascii="Calibri" w:hAnsi="Calibri" w:eastAsia="Calibri" w:cs="Calibri"/>
+      <w:rFonts w:ascii="Calibri" w:eastAsia="Calibri" w:hAnsi="Calibri" w:cs="Calibri"/>
       <w:sz w:val="22"/>
       <w:szCs w:val="22"/>
-      <w:lang w:val="pt-BR" w:eastAsia="pt-BR" w:bidi="ar-SA"/>
     </w:rPr>
   </w:style>
-  <w:style w:type="paragraph" w:styleId="2">
+  <w:style w:type="paragraph" w:styleId="Ttulo1">
     <w:name w:val="heading 1"/>
-    <w:basedOn w:val="1"/>
-    <w:next w:val="1"/>
+    <w:basedOn w:val="Normal"/>
+    <w:next w:val="Normal"/>
+    <w:uiPriority w:val="9"/>
     <w:qFormat/>
-    <w:uiPriority w:val="9"/>
+    <w:rsid w:val="00663F73"/>
     <w:pPr>
       <w:keepNext/>
       <w:keepLines/>
@@ -1386,14 +1210,15 @@
       <w:szCs w:val="48"/>
     </w:rPr>
   </w:style>
-  <w:style w:type="paragraph" w:styleId="3">
+  <w:style w:type="paragraph" w:styleId="Ttulo2">
     <w:name w:val="heading 2"/>
-    <w:basedOn w:val="1"/>
-    <w:next w:val="1"/>
+    <w:basedOn w:val="Normal"/>
+    <w:next w:val="Normal"/>
+    <w:uiPriority w:val="9"/>
     <w:semiHidden/>
     <w:unhideWhenUsed/>
     <w:qFormat/>
-    <w:uiPriority w:val="9"/>
+    <w:rsid w:val="00663F73"/>
     <w:pPr>
       <w:keepNext/>
       <w:keepLines/>
@@ -1406,14 +1231,15 @@
       <w:szCs w:val="36"/>
     </w:rPr>
   </w:style>
-  <w:style w:type="paragraph" w:styleId="4">
+  <w:style w:type="paragraph" w:styleId="Ttulo3">
     <w:name w:val="heading 3"/>
-    <w:basedOn w:val="1"/>
-    <w:next w:val="1"/>
+    <w:basedOn w:val="Normal"/>
+    <w:next w:val="Normal"/>
+    <w:uiPriority w:val="9"/>
     <w:semiHidden/>
     <w:unhideWhenUsed/>
     <w:qFormat/>
-    <w:uiPriority w:val="9"/>
+    <w:rsid w:val="00663F73"/>
     <w:pPr>
       <w:keepNext/>
       <w:keepLines/>
@@ -1426,14 +1252,15 @@
       <w:szCs w:val="28"/>
     </w:rPr>
   </w:style>
-  <w:style w:type="paragraph" w:styleId="5">
+  <w:style w:type="paragraph" w:styleId="Ttulo4">
     <w:name w:val="heading 4"/>
-    <w:basedOn w:val="1"/>
-    <w:next w:val="1"/>
+    <w:basedOn w:val="Normal"/>
+    <w:next w:val="Normal"/>
+    <w:uiPriority w:val="9"/>
     <w:semiHidden/>
     <w:unhideWhenUsed/>
     <w:qFormat/>
-    <w:uiPriority w:val="9"/>
+    <w:rsid w:val="00663F73"/>
     <w:pPr>
       <w:keepNext/>
       <w:keepLines/>
@@ -1446,14 +1273,15 @@
       <w:szCs w:val="24"/>
     </w:rPr>
   </w:style>
-  <w:style w:type="paragraph" w:styleId="6">
+  <w:style w:type="paragraph" w:styleId="Ttulo5">
     <w:name w:val="heading 5"/>
-    <w:basedOn w:val="1"/>
-    <w:next w:val="1"/>
+    <w:basedOn w:val="Normal"/>
+    <w:next w:val="Normal"/>
+    <w:uiPriority w:val="9"/>
     <w:semiHidden/>
     <w:unhideWhenUsed/>
     <w:qFormat/>
-    <w:uiPriority w:val="9"/>
+    <w:rsid w:val="00663F73"/>
     <w:pPr>
       <w:keepNext/>
       <w:keepLines/>
@@ -1464,14 +1292,15 @@
       <w:b/>
     </w:rPr>
   </w:style>
-  <w:style w:type="paragraph" w:styleId="7">
+  <w:style w:type="paragraph" w:styleId="Ttulo6">
     <w:name w:val="heading 6"/>
-    <w:basedOn w:val="1"/>
-    <w:next w:val="1"/>
+    <w:basedOn w:val="Normal"/>
+    <w:next w:val="Normal"/>
+    <w:uiPriority w:val="9"/>
     <w:semiHidden/>
     <w:unhideWhenUsed/>
     <w:qFormat/>
-    <w:uiPriority w:val="9"/>
+    <w:rsid w:val="00663F73"/>
     <w:pPr>
       <w:keepNext/>
       <w:keepLines/>
@@ -1484,20 +1313,20 @@
       <w:szCs w:val="20"/>
     </w:rPr>
   </w:style>
-  <w:style w:type="character" w:default="1" w:styleId="8">
+  <w:style w:type="character" w:default="1" w:styleId="Fontepargpadro">
     <w:name w:val="Default Paragraph Font"/>
+    <w:uiPriority w:val="1"/>
+    <w:semiHidden/>
+    <w:unhideWhenUsed/>
+  </w:style>
+  <w:style w:type="table" w:default="1" w:styleId="Tabelanormal">
+    <w:name w:val="Normal Table"/>
+    <w:uiPriority w:val="99"/>
     <w:semiHidden/>
     <w:unhideWhenUsed/>
     <w:qFormat/>
-    <w:uiPriority w:val="1"/>
-  </w:style>
-  <w:style w:type="table" w:default="1" w:styleId="9">
-    <w:name w:val="Normal Table"/>
-    <w:semiHidden/>
-    <w:unhideWhenUsed/>
-    <w:qFormat/>
-    <w:uiPriority w:val="99"/>
     <w:tblPr>
+      <w:tblInd w:w="0" w:type="dxa"/>
       <w:tblCellMar>
         <w:top w:w="0" w:type="dxa"/>
         <w:left w:w="108" w:type="dxa"/>
@@ -1506,12 +1335,19 @@
       </w:tblCellMar>
     </w:tblPr>
   </w:style>
-  <w:style w:type="paragraph" w:styleId="10">
+  <w:style w:type="numbering" w:default="1" w:styleId="Semlista">
+    <w:name w:val="No List"/>
+    <w:uiPriority w:val="99"/>
+    <w:semiHidden/>
+    <w:unhideWhenUsed/>
+  </w:style>
+  <w:style w:type="paragraph" w:styleId="Ttulo">
     <w:name w:val="Title"/>
-    <w:basedOn w:val="1"/>
-    <w:next w:val="1"/>
+    <w:basedOn w:val="Normal"/>
+    <w:next w:val="Normal"/>
+    <w:uiPriority w:val="10"/>
     <w:qFormat/>
-    <w:uiPriority w:val="10"/>
+    <w:rsid w:val="00663F73"/>
     <w:pPr>
       <w:keepNext/>
       <w:keepLines/>
@@ -1523,13 +1359,14 @@
       <w:szCs w:val="72"/>
     </w:rPr>
   </w:style>
-  <w:style w:type="paragraph" w:styleId="11">
+  <w:style w:type="paragraph" w:styleId="Rodap">
     <w:name w:val="footer"/>
-    <w:basedOn w:val="1"/>
-    <w:link w:val="17"/>
+    <w:basedOn w:val="Normal"/>
+    <w:link w:val="RodapChar"/>
+    <w:uiPriority w:val="99"/>
     <w:unhideWhenUsed/>
     <w:qFormat/>
-    <w:uiPriority w:val="99"/>
+    <w:rsid w:val="00663F73"/>
     <w:pPr>
       <w:tabs>
         <w:tab w:val="center" w:pos="4252"/>
@@ -1538,14 +1375,15 @@
       <w:spacing w:after="0" w:line="240" w:lineRule="auto"/>
     </w:pPr>
   </w:style>
-  <w:style w:type="paragraph" w:styleId="12">
+  <w:style w:type="paragraph" w:styleId="Textodebalo">
     <w:name w:val="Balloon Text"/>
-    <w:basedOn w:val="1"/>
-    <w:link w:val="16"/>
+    <w:basedOn w:val="Normal"/>
+    <w:link w:val="TextodebaloChar"/>
+    <w:uiPriority w:val="99"/>
     <w:semiHidden/>
     <w:unhideWhenUsed/>
     <w:qFormat/>
-    <w:uiPriority w:val="99"/>
+    <w:rsid w:val="00663F73"/>
     <w:pPr>
       <w:spacing w:after="0" w:line="240" w:lineRule="auto"/>
     </w:pPr>
@@ -1555,29 +1393,30 @@
       <w:szCs w:val="18"/>
     </w:rPr>
   </w:style>
-  <w:style w:type="paragraph" w:styleId="13">
+  <w:style w:type="paragraph" w:styleId="Subttulo">
     <w:name w:val="Subtitle"/>
-    <w:basedOn w:val="1"/>
-    <w:next w:val="1"/>
+    <w:basedOn w:val="Normal"/>
+    <w:next w:val="Normal"/>
+    <w:uiPriority w:val="11"/>
     <w:qFormat/>
-    <w:uiPriority w:val="11"/>
+    <w:rsid w:val="00663F73"/>
     <w:pPr>
       <w:keepNext/>
       <w:keepLines/>
       <w:spacing w:before="360" w:after="80"/>
     </w:pPr>
     <w:rPr>
-      <w:rFonts w:ascii="Georgia" w:hAnsi="Georgia" w:eastAsia="Georgia" w:cs="Georgia"/>
+      <w:rFonts w:ascii="Georgia" w:eastAsia="Georgia" w:hAnsi="Georgia" w:cs="Georgia"/>
       <w:i/>
       <w:color w:val="666666"/>
       <w:sz w:val="48"/>
       <w:szCs w:val="48"/>
     </w:rPr>
   </w:style>
-  <w:style w:type="table" w:customStyle="1" w:styleId="14">
+  <w:style w:type="table" w:customStyle="1" w:styleId="TableNormal">
     <w:name w:val="Table Normal"/>
     <w:qFormat/>
-    <w:uiPriority w:val="0"/>
+    <w:rsid w:val="00663F73"/>
     <w:tblPr>
       <w:tblCellMar>
         <w:top w:w="0" w:type="dxa"/>
@@ -1587,11 +1426,11 @@
       </w:tblCellMar>
     </w:tblPr>
   </w:style>
-  <w:style w:type="table" w:customStyle="1" w:styleId="15">
+  <w:style w:type="table" w:customStyle="1" w:styleId="Style12">
     <w:name w:val="_Style 12"/>
-    <w:basedOn w:val="14"/>
+    <w:basedOn w:val="TableNormal"/>
     <w:qFormat/>
-    <w:uiPriority w:val="0"/>
+    <w:rsid w:val="00663F73"/>
     <w:tblPr>
       <w:tblCellMar>
         <w:top w:w="0" w:type="dxa"/>
@@ -1601,42 +1440,45 @@
       </w:tblCellMar>
     </w:tblPr>
   </w:style>
-  <w:style w:type="character" w:customStyle="1" w:styleId="16">
+  <w:style w:type="character" w:customStyle="1" w:styleId="TextodebaloChar">
     <w:name w:val="Texto de balão Char"/>
-    <w:basedOn w:val="8"/>
-    <w:link w:val="12"/>
+    <w:basedOn w:val="Fontepargpadro"/>
+    <w:link w:val="Textodebalo"/>
+    <w:uiPriority w:val="99"/>
     <w:semiHidden/>
     <w:qFormat/>
-    <w:uiPriority w:val="99"/>
+    <w:rsid w:val="00663F73"/>
     <w:rPr>
-      <w:rFonts w:ascii="Segoe UI" w:hAnsi="Segoe UI" w:eastAsia="Calibri" w:cs="Segoe UI"/>
+      <w:rFonts w:ascii="Segoe UI" w:eastAsia="Calibri" w:hAnsi="Segoe UI" w:cs="Segoe UI"/>
       <w:sz w:val="18"/>
       <w:szCs w:val="18"/>
     </w:rPr>
   </w:style>
-  <w:style w:type="character" w:customStyle="1" w:styleId="17">
+  <w:style w:type="character" w:customStyle="1" w:styleId="RodapChar">
     <w:name w:val="Rodapé Char"/>
-    <w:basedOn w:val="8"/>
-    <w:link w:val="11"/>
+    <w:basedOn w:val="Fontepargpadro"/>
+    <w:link w:val="Rodap"/>
+    <w:uiPriority w:val="99"/>
     <w:qFormat/>
-    <w:uiPriority w:val="99"/>
+    <w:rsid w:val="00663F73"/>
     <w:rPr>
-      <w:rFonts w:ascii="Calibri" w:hAnsi="Calibri" w:eastAsia="Calibri" w:cs="Calibri"/>
+      <w:rFonts w:ascii="Calibri" w:eastAsia="Calibri" w:hAnsi="Calibri" w:cs="Calibri"/>
       <w:sz w:val="22"/>
       <w:szCs w:val="22"/>
     </w:rPr>
   </w:style>
-  <w:style w:type="paragraph" w:styleId="18">
+  <w:style w:type="paragraph" w:styleId="PargrafodaLista">
     <w:name w:val="List Paragraph"/>
-    <w:basedOn w:val="1"/>
+    <w:basedOn w:val="Normal"/>
+    <w:uiPriority w:val="34"/>
     <w:qFormat/>
-    <w:uiPriority w:val="34"/>
+    <w:rsid w:val="00663F73"/>
     <w:pPr>
       <w:ind w:left="720"/>
       <w:contextualSpacing/>
     </w:pPr>
     <w:rPr>
-      <w:rFonts w:asciiTheme="minorHAnsi" w:hAnsiTheme="minorHAnsi" w:eastAsiaTheme="minorHAnsi" w:cstheme="minorBidi"/>
+      <w:rFonts w:asciiTheme="minorHAnsi" w:eastAsiaTheme="minorHAnsi" w:hAnsiTheme="minorHAnsi" w:cstheme="minorBidi"/>
       <w:lang w:eastAsia="en-US"/>
     </w:rPr>
   </w:style>
@@ -1959,10 +1801,15 @@
       </a:style>
     </a:lnDef>
   </a:objectDefaults>
+  <a:extraClrSchemeLst/>
 </a:theme>
 </file>
 
 <file path=customXml/item1.xml><?xml version="1.0" encoding="utf-8"?>
+<b:Sources xmlns:b="http://schemas.openxmlformats.org/officeDocument/2006/bibliography" xmlns="http://schemas.openxmlformats.org/officeDocument/2006/bibliography" SelectedStyle="\APASixthEditionOfficeOnline.xsl" StyleName="APA" Version="6"/>
+</file>
+
+<file path=customXml/item2.xml><?xml version="1.0" encoding="utf-8"?>
 <s:customData xmlns="http://www.wps.cn/officeDocument/2013/wpsCustomData" xmlns:s="http://www.wps.cn/officeDocument/2013/wpsCustomData">
   <customSectProps/>
   <customShpExts>
@@ -1973,20 +1820,18 @@
 </s:customData>
 </file>
 
-<file path=customXml/item2.xml><?xml version="1.0" encoding="utf-8"?>
-<b:Sources xmlns:b="http://schemas.openxmlformats.org/officeDocument/2006/bibliography" xmlns="http://schemas.openxmlformats.org/officeDocument/2006/bibliography" SelectedStyle="\APASixthEditionOfficeOnline.xsl" StyleName="APA" Version="6"/>
+<file path=customXml/itemProps1.xml><?xml version="1.0" encoding="utf-8"?>
+<ds:datastoreItem xmlns:ds="http://schemas.openxmlformats.org/officeDocument/2006/customXml" ds:itemID="{94B43671-E965-4E0A-92B1-49CF6340AED8}">
+  <ds:schemaRefs>
+    <ds:schemaRef ds:uri="http://schemas.openxmlformats.org/officeDocument/2006/bibliography"/>
+  </ds:schemaRefs>
+</ds:datastoreItem>
 </file>
 
-<file path=customXml/itemProps1.xml><?xml version="1.0" encoding="utf-8"?>
+<file path=customXml/itemProps2.xml><?xml version="1.0" encoding="utf-8"?>
 <ds:datastoreItem xmlns:ds="http://schemas.openxmlformats.org/officeDocument/2006/customXml" ds:itemID="{B1977F7D-205B-4081-913C-38D41E755F92}">
   <ds:schemaRefs>
     <ds:schemaRef ds:uri="http://www.wps.cn/officeDocument/2013/wpsCustomData"/>
   </ds:schemaRefs>
 </ds:datastoreItem>
-</file>
-
-<file path=customXml/itemProps2.xml><?xml version="1.0" encoding="utf-8"?>
-<ds:datastoreItem xmlns:ds="http://schemas.openxmlformats.org/officeDocument/2006/customXml" ds:itemID="{94B43671-E965-4E0A-92B1-49CF6340AED8}">
-  <ds:schemaRefs/>
-</ds:datastoreItem>
 </file>
</xml_diff>